<commit_message>
updating changes for Milestone1
</commit_message>
<xml_diff>
--- a/Milestone1/CSC500 Module 4 - Portfolio Milestone.docx
+++ b/Milestone1/CSC500 Module 4 - Portfolio Milestone.docx
@@ -249,21 +249,7 @@
           <w:rFonts w:ascii="Calibri" w:hAnsi="Calibri" w:cs="Calibri"/>
         </w:rPr>
         <w:br/>
-        <w:t xml:space="preserve">class </w:t>
-      </w:r>
-      <w:proofErr w:type="spellStart"/>
-      <w:r>
-        <w:rPr>
-          <w:rFonts w:ascii="Calibri" w:hAnsi="Calibri" w:cs="Calibri"/>
-        </w:rPr>
-        <w:t>ItemToPurchase</w:t>
-      </w:r>
-      <w:proofErr w:type="spellEnd"/>
-      <w:r>
-        <w:rPr>
-          <w:rFonts w:ascii="Calibri" w:hAnsi="Calibri" w:cs="Calibri"/>
-        </w:rPr>
-        <w:t>:</w:t>
+        <w:t>class ItemToPurchase:</w:t>
       </w:r>
       <w:r>
         <w:rPr>
@@ -283,84 +269,28 @@
           <w:rFonts w:ascii="Calibri" w:hAnsi="Calibri" w:cs="Calibri"/>
         </w:rPr>
         <w:br/>
-        <w:t xml:space="preserve">    def __</w:t>
-      </w:r>
-      <w:proofErr w:type="spellStart"/>
-      <w:r>
-        <w:rPr>
-          <w:rFonts w:ascii="Calibri" w:hAnsi="Calibri" w:cs="Calibri"/>
-        </w:rPr>
-        <w:t>init</w:t>
-      </w:r>
-      <w:proofErr w:type="spellEnd"/>
-      <w:r>
-        <w:rPr>
-          <w:rFonts w:ascii="Calibri" w:hAnsi="Calibri" w:cs="Calibri"/>
-        </w:rPr>
-        <w:t>__(self, name = "none", price = 0.0, quantity = 0):</w:t>
-      </w:r>
-      <w:r>
-        <w:rPr>
-          <w:rFonts w:ascii="Calibri" w:hAnsi="Calibri" w:cs="Calibri"/>
-        </w:rPr>
-        <w:br/>
-        <w:t xml:space="preserve">        </w:t>
-      </w:r>
-      <w:proofErr w:type="spellStart"/>
-      <w:r>
-        <w:rPr>
-          <w:rFonts w:ascii="Calibri" w:hAnsi="Calibri" w:cs="Calibri"/>
-        </w:rPr>
-        <w:t>self.itemName</w:t>
-      </w:r>
-      <w:proofErr w:type="spellEnd"/>
-      <w:r>
-        <w:rPr>
-          <w:rFonts w:ascii="Calibri" w:hAnsi="Calibri" w:cs="Calibri"/>
-        </w:rPr>
-        <w:t xml:space="preserve"> = name</w:t>
-      </w:r>
-      <w:r>
-        <w:rPr>
-          <w:rFonts w:ascii="Calibri" w:hAnsi="Calibri" w:cs="Calibri"/>
-        </w:rPr>
-        <w:br/>
-        <w:t xml:space="preserve">        </w:t>
-      </w:r>
-      <w:proofErr w:type="spellStart"/>
-      <w:r>
-        <w:rPr>
-          <w:rFonts w:ascii="Calibri" w:hAnsi="Calibri" w:cs="Calibri"/>
-        </w:rPr>
-        <w:t>self.itemPrice</w:t>
-      </w:r>
-      <w:proofErr w:type="spellEnd"/>
-      <w:r>
-        <w:rPr>
-          <w:rFonts w:ascii="Calibri" w:hAnsi="Calibri" w:cs="Calibri"/>
-        </w:rPr>
-        <w:t xml:space="preserve"> = price</w:t>
-      </w:r>
-      <w:r>
-        <w:rPr>
-          <w:rFonts w:ascii="Calibri" w:hAnsi="Calibri" w:cs="Calibri"/>
-        </w:rPr>
-        <w:br/>
-        <w:t xml:space="preserve">        </w:t>
-      </w:r>
-      <w:proofErr w:type="spellStart"/>
-      <w:r>
-        <w:rPr>
-          <w:rFonts w:ascii="Calibri" w:hAnsi="Calibri" w:cs="Calibri"/>
-        </w:rPr>
-        <w:t>self.itemQuantity</w:t>
-      </w:r>
-      <w:proofErr w:type="spellEnd"/>
-      <w:r>
-        <w:rPr>
-          <w:rFonts w:ascii="Calibri" w:hAnsi="Calibri" w:cs="Calibri"/>
-        </w:rPr>
-        <w:t xml:space="preserve"> = quantity</w:t>
+        <w:t xml:space="preserve">    def __init__(self, name = "none", price = 0.0, quantity = 0):</w:t>
+      </w:r>
+      <w:r>
+        <w:rPr>
+          <w:rFonts w:ascii="Calibri" w:hAnsi="Calibri" w:cs="Calibri"/>
+        </w:rPr>
+        <w:br/>
+        <w:t xml:space="preserve">        self.itemName = name</w:t>
+      </w:r>
+      <w:r>
+        <w:rPr>
+          <w:rFonts w:ascii="Calibri" w:hAnsi="Calibri" w:cs="Calibri"/>
+        </w:rPr>
+        <w:br/>
+        <w:t xml:space="preserve">        self.itemPrice = price</w:t>
+      </w:r>
+      <w:r>
+        <w:rPr>
+          <w:rFonts w:ascii="Calibri" w:hAnsi="Calibri" w:cs="Calibri"/>
+        </w:rPr>
+        <w:br/>
+        <w:t xml:space="preserve">        self.itemQuantity = quantity</w:t>
       </w:r>
       <w:r>
         <w:rPr>
@@ -380,127 +310,21 @@
           <w:rFonts w:ascii="Calibri" w:hAnsi="Calibri" w:cs="Calibri"/>
         </w:rPr>
         <w:br/>
-        <w:t xml:space="preserve">    def </w:t>
-      </w:r>
-      <w:proofErr w:type="spellStart"/>
-      <w:r>
-        <w:rPr>
-          <w:rFonts w:ascii="Calibri" w:hAnsi="Calibri" w:cs="Calibri"/>
-        </w:rPr>
-        <w:t>print_item_cost</w:t>
-      </w:r>
-      <w:proofErr w:type="spellEnd"/>
-      <w:r>
-        <w:rPr>
-          <w:rFonts w:ascii="Calibri" w:hAnsi="Calibri" w:cs="Calibri"/>
-        </w:rPr>
-        <w:t>(self):</w:t>
-      </w:r>
-      <w:r>
-        <w:rPr>
-          <w:rFonts w:ascii="Calibri" w:hAnsi="Calibri" w:cs="Calibri"/>
-        </w:rPr>
-        <w:br/>
-        <w:t xml:space="preserve">        </w:t>
-      </w:r>
-      <w:proofErr w:type="spellStart"/>
-      <w:r>
-        <w:rPr>
-          <w:rFonts w:ascii="Calibri" w:hAnsi="Calibri" w:cs="Calibri"/>
-        </w:rPr>
-        <w:t>total_item_cost</w:t>
-      </w:r>
-      <w:proofErr w:type="spellEnd"/>
-      <w:r>
-        <w:rPr>
-          <w:rFonts w:ascii="Calibri" w:hAnsi="Calibri" w:cs="Calibri"/>
-        </w:rPr>
-        <w:t xml:space="preserve"> = </w:t>
-      </w:r>
-      <w:proofErr w:type="spellStart"/>
-      <w:r>
-        <w:rPr>
-          <w:rFonts w:ascii="Calibri" w:hAnsi="Calibri" w:cs="Calibri"/>
-        </w:rPr>
-        <w:t>self.itemPrice</w:t>
-      </w:r>
-      <w:proofErr w:type="spellEnd"/>
-      <w:r>
-        <w:rPr>
-          <w:rFonts w:ascii="Calibri" w:hAnsi="Calibri" w:cs="Calibri"/>
-        </w:rPr>
-        <w:t xml:space="preserve"> * </w:t>
-      </w:r>
-      <w:proofErr w:type="spellStart"/>
-      <w:r>
-        <w:rPr>
-          <w:rFonts w:ascii="Calibri" w:hAnsi="Calibri" w:cs="Calibri"/>
-        </w:rPr>
-        <w:t>self.itemQuantity</w:t>
-      </w:r>
-      <w:proofErr w:type="spellEnd"/>
-      <w:r>
-        <w:rPr>
-          <w:rFonts w:ascii="Calibri" w:hAnsi="Calibri" w:cs="Calibri"/>
-        </w:rPr>
-        <w:br/>
-        <w:t xml:space="preserve">        print(f"\n{</w:t>
-      </w:r>
-      <w:proofErr w:type="spellStart"/>
-      <w:r>
-        <w:rPr>
-          <w:rFonts w:ascii="Calibri" w:hAnsi="Calibri" w:cs="Calibri"/>
-        </w:rPr>
-        <w:t>self.itemName</w:t>
-      </w:r>
-      <w:proofErr w:type="spellEnd"/>
-      <w:r>
-        <w:rPr>
-          <w:rFonts w:ascii="Calibri" w:hAnsi="Calibri" w:cs="Calibri"/>
-        </w:rPr>
-        <w:t>} {</w:t>
-      </w:r>
-      <w:proofErr w:type="spellStart"/>
-      <w:r>
-        <w:rPr>
-          <w:rFonts w:ascii="Calibri" w:hAnsi="Calibri" w:cs="Calibri"/>
-        </w:rPr>
-        <w:t>self.itemQuantity</w:t>
-      </w:r>
-      <w:proofErr w:type="spellEnd"/>
-      <w:r>
-        <w:rPr>
-          <w:rFonts w:ascii="Calibri" w:hAnsi="Calibri" w:cs="Calibri"/>
-        </w:rPr>
-        <w:t>} @ ${</w:t>
-      </w:r>
-      <w:proofErr w:type="spellStart"/>
-      <w:r>
-        <w:rPr>
-          <w:rFonts w:ascii="Calibri" w:hAnsi="Calibri" w:cs="Calibri"/>
-        </w:rPr>
-        <w:t>self.itemPrice</w:t>
-      </w:r>
-      <w:proofErr w:type="spellEnd"/>
-      <w:r>
-        <w:rPr>
-          <w:rFonts w:ascii="Calibri" w:hAnsi="Calibri" w:cs="Calibri"/>
-        </w:rPr>
-        <w:t>} = ${</w:t>
-      </w:r>
-      <w:proofErr w:type="spellStart"/>
-      <w:r>
-        <w:rPr>
-          <w:rFonts w:ascii="Calibri" w:hAnsi="Calibri" w:cs="Calibri"/>
-        </w:rPr>
-        <w:t>total_item_cost</w:t>
-      </w:r>
-      <w:proofErr w:type="spellEnd"/>
-      <w:r>
-        <w:rPr>
-          <w:rFonts w:ascii="Calibri" w:hAnsi="Calibri" w:cs="Calibri"/>
-        </w:rPr>
-        <w:t>}")</w:t>
+        <w:t xml:space="preserve">    def print_item_cost(self):</w:t>
+      </w:r>
+      <w:r>
+        <w:rPr>
+          <w:rFonts w:ascii="Calibri" w:hAnsi="Calibri" w:cs="Calibri"/>
+        </w:rPr>
+        <w:br/>
+        <w:t xml:space="preserve">        total_item_cost = self.itemPrice * self.itemQuantity</w:t>
+      </w:r>
+      <w:r>
+        <w:rPr>
+          <w:rFonts w:ascii="Calibri" w:hAnsi="Calibri" w:cs="Calibri"/>
+        </w:rPr>
+        <w:br/>
+        <w:t xml:space="preserve">        print(f"\n{self.itemName} {self.itemQuantity} @ ${self.itemPrice} = ${total_item_cost}")</w:t>
       </w:r>
       <w:r>
         <w:rPr>
@@ -520,35 +344,7 @@
           <w:rFonts w:ascii="Calibri" w:hAnsi="Calibri" w:cs="Calibri"/>
         </w:rPr>
         <w:br/>
-        <w:t xml:space="preserve">def </w:t>
-      </w:r>
-      <w:proofErr w:type="spellStart"/>
-      <w:r>
-        <w:rPr>
-          <w:rFonts w:ascii="Calibri" w:hAnsi="Calibri" w:cs="Calibri"/>
-        </w:rPr>
-        <w:t>get_valid_item_name</w:t>
-      </w:r>
-      <w:proofErr w:type="spellEnd"/>
-      <w:r>
-        <w:rPr>
-          <w:rFonts w:ascii="Calibri" w:hAnsi="Calibri" w:cs="Calibri"/>
-        </w:rPr>
-        <w:t>(</w:t>
-      </w:r>
-      <w:proofErr w:type="spellStart"/>
-      <w:r>
-        <w:rPr>
-          <w:rFonts w:ascii="Calibri" w:hAnsi="Calibri" w:cs="Calibri"/>
-        </w:rPr>
-        <w:t>existing_items</w:t>
-      </w:r>
-      <w:proofErr w:type="spellEnd"/>
-      <w:r>
-        <w:rPr>
-          <w:rFonts w:ascii="Calibri" w:hAnsi="Calibri" w:cs="Calibri"/>
-        </w:rPr>
-        <w:t>):</w:t>
+        <w:t>def get_valid_item_name(existing_items):</w:t>
       </w:r>
       <w:r>
         <w:rPr>
@@ -562,21 +358,7 @@
           <w:rFonts w:ascii="Calibri" w:hAnsi="Calibri" w:cs="Calibri"/>
         </w:rPr>
         <w:br/>
-        <w:t xml:space="preserve">        </w:t>
-      </w:r>
-      <w:proofErr w:type="spellStart"/>
-      <w:r>
-        <w:rPr>
-          <w:rFonts w:ascii="Calibri" w:hAnsi="Calibri" w:cs="Calibri"/>
-        </w:rPr>
-        <w:t>item_name</w:t>
-      </w:r>
-      <w:proofErr w:type="spellEnd"/>
-      <w:r>
-        <w:rPr>
-          <w:rFonts w:ascii="Calibri" w:hAnsi="Calibri" w:cs="Calibri"/>
-        </w:rPr>
-        <w:t xml:space="preserve"> = input("Enter Purchased Item Name: \n").strip()</w:t>
+        <w:t xml:space="preserve">        item_name = input("Enter Purchased Item Name: \n").strip()</w:t>
       </w:r>
       <w:r>
         <w:rPr>
@@ -596,21 +378,7 @@
           <w:rFonts w:ascii="Calibri" w:hAnsi="Calibri" w:cs="Calibri"/>
         </w:rPr>
         <w:br/>
-        <w:t xml:space="preserve">        if </w:t>
-      </w:r>
-      <w:proofErr w:type="spellStart"/>
-      <w:r>
-        <w:rPr>
-          <w:rFonts w:ascii="Calibri" w:hAnsi="Calibri" w:cs="Calibri"/>
-        </w:rPr>
-        <w:t>item_name</w:t>
-      </w:r>
-      <w:proofErr w:type="spellEnd"/>
-      <w:r>
-        <w:rPr>
-          <w:rFonts w:ascii="Calibri" w:hAnsi="Calibri" w:cs="Calibri"/>
-        </w:rPr>
-        <w:t xml:space="preserve"> == "":</w:t>
+        <w:t xml:space="preserve">        if item_name == "":</w:t>
       </w:r>
       <w:r>
         <w:rPr>
@@ -631,79 +399,21 @@
         </w:rPr>
         <w:lastRenderedPageBreak/>
         <w:br/>
-        <w:t xml:space="preserve">        # Validation to prevent item names with only </w:t>
-      </w:r>
-      <w:proofErr w:type="spellStart"/>
-      <w:r>
-        <w:rPr>
-          <w:rFonts w:ascii="Calibri" w:hAnsi="Calibri" w:cs="Calibri"/>
-        </w:rPr>
-        <w:t>Numericals</w:t>
-      </w:r>
-      <w:proofErr w:type="spellEnd"/>
-      <w:r>
-        <w:rPr>
-          <w:rFonts w:ascii="Calibri" w:hAnsi="Calibri" w:cs="Calibri"/>
-        </w:rPr>
-        <w:br/>
-        <w:t xml:space="preserve">        </w:t>
-      </w:r>
-      <w:proofErr w:type="spellStart"/>
-      <w:r>
-        <w:rPr>
-          <w:rFonts w:ascii="Calibri" w:hAnsi="Calibri" w:cs="Calibri"/>
-        </w:rPr>
-        <w:t>elif</w:t>
-      </w:r>
-      <w:proofErr w:type="spellEnd"/>
-      <w:r>
-        <w:rPr>
-          <w:rFonts w:ascii="Calibri" w:hAnsi="Calibri" w:cs="Calibri"/>
-        </w:rPr>
-        <w:t xml:space="preserve"> </w:t>
-      </w:r>
-      <w:proofErr w:type="spellStart"/>
-      <w:r>
-        <w:rPr>
-          <w:rFonts w:ascii="Calibri" w:hAnsi="Calibri" w:cs="Calibri"/>
-        </w:rPr>
-        <w:t>item_</w:t>
-      </w:r>
-      <w:proofErr w:type="gramStart"/>
-      <w:r>
-        <w:rPr>
-          <w:rFonts w:ascii="Calibri" w:hAnsi="Calibri" w:cs="Calibri"/>
-        </w:rPr>
-        <w:t>name.isnumeric</w:t>
-      </w:r>
-      <w:proofErr w:type="spellEnd"/>
-      <w:proofErr w:type="gramEnd"/>
-      <w:r>
-        <w:rPr>
-          <w:rFonts w:ascii="Calibri" w:hAnsi="Calibri" w:cs="Calibri"/>
-        </w:rPr>
-        <w:t>():</w:t>
-      </w:r>
-      <w:r>
-        <w:rPr>
-          <w:rFonts w:ascii="Calibri" w:hAnsi="Calibri" w:cs="Calibri"/>
-        </w:rPr>
-        <w:br/>
-        <w:t xml:space="preserve">            </w:t>
-      </w:r>
-      <w:proofErr w:type="gramStart"/>
-      <w:r>
-        <w:rPr>
-          <w:rFonts w:ascii="Calibri" w:hAnsi="Calibri" w:cs="Calibri"/>
-        </w:rPr>
-        <w:t>print(</w:t>
-      </w:r>
-      <w:proofErr w:type="gramEnd"/>
-      <w:r>
-        <w:rPr>
-          <w:rFonts w:ascii="Calibri" w:hAnsi="Calibri" w:cs="Calibri"/>
-        </w:rPr>
-        <w:t>"Warning!! Item Name cannot contain only Numerical Characters.\n")</w:t>
+        <w:t xml:space="preserve">        # Validation to prevent item names with only Numericals</w:t>
+      </w:r>
+      <w:r>
+        <w:rPr>
+          <w:rFonts w:ascii="Calibri" w:hAnsi="Calibri" w:cs="Calibri"/>
+        </w:rPr>
+        <w:br/>
+        <w:t xml:space="preserve">        elif item_name.isnumeric():</w:t>
+      </w:r>
+      <w:r>
+        <w:rPr>
+          <w:rFonts w:ascii="Calibri" w:hAnsi="Calibri" w:cs="Calibri"/>
+        </w:rPr>
+        <w:br/>
+        <w:t xml:space="preserve">            print("Warning!! Item Name cannot contain only Numerical Characters.\n")</w:t>
       </w:r>
       <w:r>
         <w:rPr>
@@ -723,86 +433,14 @@
           <w:rFonts w:ascii="Calibri" w:hAnsi="Calibri" w:cs="Calibri"/>
         </w:rPr>
         <w:br/>
-        <w:t xml:space="preserve">        </w:t>
-      </w:r>
-      <w:proofErr w:type="spellStart"/>
-      <w:r>
-        <w:rPr>
-          <w:rFonts w:ascii="Calibri" w:hAnsi="Calibri" w:cs="Calibri"/>
-        </w:rPr>
-        <w:t>elif</w:t>
-      </w:r>
-      <w:proofErr w:type="spellEnd"/>
-      <w:r>
-        <w:rPr>
-          <w:rFonts w:ascii="Calibri" w:hAnsi="Calibri" w:cs="Calibri"/>
-        </w:rPr>
-        <w:t xml:space="preserve"> not </w:t>
-      </w:r>
-      <w:proofErr w:type="spellStart"/>
-      <w:r>
-        <w:rPr>
-          <w:rFonts w:ascii="Calibri" w:hAnsi="Calibri" w:cs="Calibri"/>
-        </w:rPr>
-        <w:t>item_</w:t>
-      </w:r>
-      <w:proofErr w:type="gramStart"/>
-      <w:r>
-        <w:rPr>
-          <w:rFonts w:ascii="Calibri" w:hAnsi="Calibri" w:cs="Calibri"/>
-        </w:rPr>
-        <w:t>name.replace</w:t>
-      </w:r>
-      <w:proofErr w:type="spellEnd"/>
-      <w:proofErr w:type="gramEnd"/>
-      <w:r>
-        <w:rPr>
-          <w:rFonts w:ascii="Calibri" w:hAnsi="Calibri" w:cs="Calibri"/>
-        </w:rPr>
-        <w:t>(" ", ""</w:t>
-      </w:r>
-      <w:proofErr w:type="gramStart"/>
-      <w:r>
-        <w:rPr>
-          <w:rFonts w:ascii="Calibri" w:hAnsi="Calibri" w:cs="Calibri"/>
-        </w:rPr>
-        <w:t>).</w:t>
-      </w:r>
-      <w:proofErr w:type="spellStart"/>
-      <w:r>
-        <w:rPr>
-          <w:rFonts w:ascii="Calibri" w:hAnsi="Calibri" w:cs="Calibri"/>
-        </w:rPr>
-        <w:t>isalnum</w:t>
-      </w:r>
-      <w:proofErr w:type="spellEnd"/>
-      <w:proofErr w:type="gramEnd"/>
-      <w:r>
-        <w:rPr>
-          <w:rFonts w:ascii="Calibri" w:hAnsi="Calibri" w:cs="Calibri"/>
-        </w:rPr>
-        <w:t>():</w:t>
-      </w:r>
-      <w:r>
-        <w:rPr>
-          <w:rFonts w:ascii="Calibri" w:hAnsi="Calibri" w:cs="Calibri"/>
-        </w:rPr>
-        <w:br/>
-        <w:t xml:space="preserve">            </w:t>
-      </w:r>
-      <w:proofErr w:type="gramStart"/>
-      <w:r>
-        <w:rPr>
-          <w:rFonts w:ascii="Calibri" w:hAnsi="Calibri" w:cs="Calibri"/>
-        </w:rPr>
-        <w:t>print(</w:t>
-      </w:r>
-      <w:proofErr w:type="gramEnd"/>
-      <w:r>
-        <w:rPr>
-          <w:rFonts w:ascii="Calibri" w:hAnsi="Calibri" w:cs="Calibri"/>
-        </w:rPr>
-        <w:t>"Warning!! Item Name cannot contain Special Characters.\n")</w:t>
+        <w:t xml:space="preserve">        elif not item_name.replace(" ", "").isalnum():</w:t>
+      </w:r>
+      <w:r>
+        <w:rPr>
+          <w:rFonts w:ascii="Calibri" w:hAnsi="Calibri" w:cs="Calibri"/>
+        </w:rPr>
+        <w:br/>
+        <w:t xml:space="preserve">            print("Warning!! Item Name cannot contain Special Characters.\n")</w:t>
       </w:r>
       <w:r>
         <w:rPr>
@@ -822,78 +460,14 @@
           <w:rFonts w:ascii="Calibri" w:hAnsi="Calibri" w:cs="Calibri"/>
         </w:rPr>
         <w:br/>
-        <w:t xml:space="preserve">        </w:t>
-      </w:r>
-      <w:proofErr w:type="spellStart"/>
-      <w:r>
-        <w:rPr>
-          <w:rFonts w:ascii="Calibri" w:hAnsi="Calibri" w:cs="Calibri"/>
-        </w:rPr>
-        <w:t>elif</w:t>
-      </w:r>
-      <w:proofErr w:type="spellEnd"/>
-      <w:r>
-        <w:rPr>
-          <w:rFonts w:ascii="Calibri" w:hAnsi="Calibri" w:cs="Calibri"/>
-        </w:rPr>
-        <w:t xml:space="preserve"> </w:t>
-      </w:r>
-      <w:proofErr w:type="spellStart"/>
-      <w:r>
-        <w:rPr>
-          <w:rFonts w:ascii="Calibri" w:hAnsi="Calibri" w:cs="Calibri"/>
-        </w:rPr>
-        <w:t>item_</w:t>
-      </w:r>
-      <w:proofErr w:type="gramStart"/>
-      <w:r>
-        <w:rPr>
-          <w:rFonts w:ascii="Calibri" w:hAnsi="Calibri" w:cs="Calibri"/>
-        </w:rPr>
-        <w:t>name.lower</w:t>
-      </w:r>
-      <w:proofErr w:type="spellEnd"/>
-      <w:proofErr w:type="gramEnd"/>
-      <w:r>
-        <w:rPr>
-          <w:rFonts w:ascii="Calibri" w:hAnsi="Calibri" w:cs="Calibri"/>
-        </w:rPr>
-        <w:t xml:space="preserve">() in </w:t>
-      </w:r>
-      <w:proofErr w:type="spellStart"/>
-      <w:r>
-        <w:rPr>
-          <w:rFonts w:ascii="Calibri" w:hAnsi="Calibri" w:cs="Calibri"/>
-        </w:rPr>
-        <w:t>existing_items</w:t>
-      </w:r>
-      <w:proofErr w:type="spellEnd"/>
-      <w:r>
-        <w:rPr>
-          <w:rFonts w:ascii="Calibri" w:hAnsi="Calibri" w:cs="Calibri"/>
-        </w:rPr>
-        <w:t>:</w:t>
-      </w:r>
-      <w:r>
-        <w:rPr>
-          <w:rFonts w:ascii="Calibri" w:hAnsi="Calibri" w:cs="Calibri"/>
-        </w:rPr>
-        <w:br/>
-        <w:t xml:space="preserve">            </w:t>
-      </w:r>
-      <w:proofErr w:type="gramStart"/>
-      <w:r>
-        <w:rPr>
-          <w:rFonts w:ascii="Calibri" w:hAnsi="Calibri" w:cs="Calibri"/>
-        </w:rPr>
-        <w:t>print(</w:t>
-      </w:r>
-      <w:proofErr w:type="gramEnd"/>
-      <w:r>
-        <w:rPr>
-          <w:rFonts w:ascii="Calibri" w:hAnsi="Calibri" w:cs="Calibri"/>
-        </w:rPr>
-        <w:t>"Warning!! Item name already exists.\n")</w:t>
+        <w:t xml:space="preserve">        elif item_name.lower() in existing_items:</w:t>
+      </w:r>
+      <w:r>
+        <w:rPr>
+          <w:rFonts w:ascii="Calibri" w:hAnsi="Calibri" w:cs="Calibri"/>
+        </w:rPr>
+        <w:br/>
+        <w:t xml:space="preserve">            print("Warning!! Item name already exists.\n")</w:t>
       </w:r>
       <w:r>
         <w:rPr>
@@ -913,51 +487,15 @@
           <w:rFonts w:ascii="Calibri" w:hAnsi="Calibri" w:cs="Calibri"/>
         </w:rPr>
         <w:br/>
-        <w:t xml:space="preserve">            </w:t>
-      </w:r>
-      <w:proofErr w:type="spellStart"/>
-      <w:r>
-        <w:rPr>
-          <w:rFonts w:ascii="Calibri" w:hAnsi="Calibri" w:cs="Calibri"/>
-        </w:rPr>
-        <w:t>existing_items.add</w:t>
-      </w:r>
-      <w:proofErr w:type="spellEnd"/>
-      <w:r>
-        <w:rPr>
-          <w:rFonts w:ascii="Calibri" w:hAnsi="Calibri" w:cs="Calibri"/>
-        </w:rPr>
-        <w:t>(</w:t>
-      </w:r>
-      <w:proofErr w:type="spellStart"/>
-      <w:r>
-        <w:rPr>
-          <w:rFonts w:ascii="Calibri" w:hAnsi="Calibri" w:cs="Calibri"/>
-        </w:rPr>
-        <w:t>item_name.lower</w:t>
-      </w:r>
-      <w:proofErr w:type="spellEnd"/>
-      <w:r>
-        <w:rPr>
-          <w:rFonts w:ascii="Calibri" w:hAnsi="Calibri" w:cs="Calibri"/>
-        </w:rPr>
-        <w:t>())</w:t>
-      </w:r>
-      <w:r>
-        <w:rPr>
-          <w:rFonts w:ascii="Calibri" w:hAnsi="Calibri" w:cs="Calibri"/>
-        </w:rPr>
-        <w:br/>
-        <w:t xml:space="preserve">            return </w:t>
-      </w:r>
-      <w:proofErr w:type="spellStart"/>
-      <w:r>
-        <w:rPr>
-          <w:rFonts w:ascii="Calibri" w:hAnsi="Calibri" w:cs="Calibri"/>
-        </w:rPr>
-        <w:t>item_name</w:t>
-      </w:r>
-      <w:proofErr w:type="spellEnd"/>
+        <w:t xml:space="preserve">            existing_items.add(item_name.lower())</w:t>
+      </w:r>
+      <w:r>
+        <w:rPr>
+          <w:rFonts w:ascii="Calibri" w:hAnsi="Calibri" w:cs="Calibri"/>
+        </w:rPr>
+        <w:br/>
+        <w:t xml:space="preserve">            return item_name</w:t>
+      </w:r>
       <w:r>
         <w:rPr>
           <w:rFonts w:ascii="Calibri" w:hAnsi="Calibri" w:cs="Calibri"/>
@@ -976,21 +514,7 @@
           <w:rFonts w:ascii="Calibri" w:hAnsi="Calibri" w:cs="Calibri"/>
         </w:rPr>
         <w:br/>
-        <w:t xml:space="preserve">def </w:t>
-      </w:r>
-      <w:proofErr w:type="spellStart"/>
-      <w:r>
-        <w:rPr>
-          <w:rFonts w:ascii="Calibri" w:hAnsi="Calibri" w:cs="Calibri"/>
-        </w:rPr>
-        <w:t>get_valid_item_quantity</w:t>
-      </w:r>
-      <w:proofErr w:type="spellEnd"/>
-      <w:r>
-        <w:rPr>
-          <w:rFonts w:ascii="Calibri" w:hAnsi="Calibri" w:cs="Calibri"/>
-        </w:rPr>
-        <w:t>():</w:t>
+        <w:t>def get_valid_item_quantity():</w:t>
       </w:r>
       <w:r>
         <w:rPr>
@@ -1004,21 +528,7 @@
           <w:rFonts w:ascii="Calibri" w:hAnsi="Calibri" w:cs="Calibri"/>
         </w:rPr>
         <w:br/>
-        <w:t xml:space="preserve">        </w:t>
-      </w:r>
-      <w:proofErr w:type="spellStart"/>
-      <w:r>
-        <w:rPr>
-          <w:rFonts w:ascii="Calibri" w:hAnsi="Calibri" w:cs="Calibri"/>
-        </w:rPr>
-        <w:t>item_quantity</w:t>
-      </w:r>
-      <w:proofErr w:type="spellEnd"/>
-      <w:r>
-        <w:rPr>
-          <w:rFonts w:ascii="Calibri" w:hAnsi="Calibri" w:cs="Calibri"/>
-        </w:rPr>
-        <w:t xml:space="preserve"> = input("Enter Purchased Item Quantity: \n").strip()</w:t>
+        <w:t xml:space="preserve">        item_quantity = input("Enter Purchased Item Quantity: \n").strip()</w:t>
       </w:r>
       <w:r>
         <w:rPr>
@@ -1038,21 +548,7 @@
           <w:rFonts w:ascii="Calibri" w:hAnsi="Calibri" w:cs="Calibri"/>
         </w:rPr>
         <w:br/>
-        <w:t xml:space="preserve">        if </w:t>
-      </w:r>
-      <w:proofErr w:type="spellStart"/>
-      <w:r>
-        <w:rPr>
-          <w:rFonts w:ascii="Calibri" w:hAnsi="Calibri" w:cs="Calibri"/>
-        </w:rPr>
-        <w:t>item_quantity</w:t>
-      </w:r>
-      <w:proofErr w:type="spellEnd"/>
-      <w:r>
-        <w:rPr>
-          <w:rFonts w:ascii="Calibri" w:hAnsi="Calibri" w:cs="Calibri"/>
-        </w:rPr>
-        <w:t xml:space="preserve"> == "":</w:t>
+        <w:t xml:space="preserve">        if item_quantity == "":</w:t>
       </w:r>
       <w:r>
         <w:rPr>
@@ -1093,21 +589,7 @@
           <w:rFonts w:ascii="Calibri" w:hAnsi="Calibri" w:cs="Calibri"/>
         </w:rPr>
         <w:br/>
-        <w:t xml:space="preserve">            quantity = int(</w:t>
-      </w:r>
-      <w:proofErr w:type="spellStart"/>
-      <w:r>
-        <w:rPr>
-          <w:rFonts w:ascii="Calibri" w:hAnsi="Calibri" w:cs="Calibri"/>
-        </w:rPr>
-        <w:t>item_quantity</w:t>
-      </w:r>
-      <w:proofErr w:type="spellEnd"/>
-      <w:r>
-        <w:rPr>
-          <w:rFonts w:ascii="Calibri" w:hAnsi="Calibri" w:cs="Calibri"/>
-        </w:rPr>
-        <w:t>)</w:t>
+        <w:t xml:space="preserve">            quantity = int(item_quantity)</w:t>
       </w:r>
       <w:r>
         <w:rPr>
@@ -1134,21 +616,7 @@
           <w:rFonts w:ascii="Calibri" w:hAnsi="Calibri" w:cs="Calibri"/>
         </w:rPr>
         <w:br/>
-        <w:t xml:space="preserve">                </w:t>
-      </w:r>
-      <w:proofErr w:type="gramStart"/>
-      <w:r>
-        <w:rPr>
-          <w:rFonts w:ascii="Calibri" w:hAnsi="Calibri" w:cs="Calibri"/>
-        </w:rPr>
-        <w:t>print(</w:t>
-      </w:r>
-      <w:proofErr w:type="gramEnd"/>
-      <w:r>
-        <w:rPr>
-          <w:rFonts w:ascii="Calibri" w:hAnsi="Calibri" w:cs="Calibri"/>
-        </w:rPr>
-        <w:t>"Warning!! Purchased Item Quantity should be greater than 0.\n")</w:t>
+        <w:t xml:space="preserve">                print("Warning!! Purchased Item Quantity should be greater than 0.\n")</w:t>
       </w:r>
       <w:r>
         <w:rPr>
@@ -1168,42 +636,14 @@
           <w:rFonts w:ascii="Calibri" w:hAnsi="Calibri" w:cs="Calibri"/>
         </w:rPr>
         <w:br/>
-        <w:t xml:space="preserve">            </w:t>
-      </w:r>
-      <w:proofErr w:type="spellStart"/>
-      <w:r>
-        <w:rPr>
-          <w:rFonts w:ascii="Calibri" w:hAnsi="Calibri" w:cs="Calibri"/>
-        </w:rPr>
-        <w:t>elif</w:t>
-      </w:r>
-      <w:proofErr w:type="spellEnd"/>
-      <w:r>
-        <w:rPr>
-          <w:rFonts w:ascii="Calibri" w:hAnsi="Calibri" w:cs="Calibri"/>
-        </w:rPr>
-        <w:t xml:space="preserve"> quantity &gt; 10000:</w:t>
-      </w:r>
-      <w:r>
-        <w:rPr>
-          <w:rFonts w:ascii="Calibri" w:hAnsi="Calibri" w:cs="Calibri"/>
-        </w:rPr>
-        <w:br/>
-        <w:t xml:space="preserve">                </w:t>
-      </w:r>
-      <w:proofErr w:type="gramStart"/>
-      <w:r>
-        <w:rPr>
-          <w:rFonts w:ascii="Calibri" w:hAnsi="Calibri" w:cs="Calibri"/>
-        </w:rPr>
-        <w:t>print(</w:t>
-      </w:r>
-      <w:proofErr w:type="gramEnd"/>
-      <w:r>
-        <w:rPr>
-          <w:rFonts w:ascii="Calibri" w:hAnsi="Calibri" w:cs="Calibri"/>
-        </w:rPr>
-        <w:t>"Warning!! Purchased Item Quantity is too high.\n")</w:t>
+        <w:t xml:space="preserve">            elif quantity &gt; 10000:</w:t>
+      </w:r>
+      <w:r>
+        <w:rPr>
+          <w:rFonts w:ascii="Calibri" w:hAnsi="Calibri" w:cs="Calibri"/>
+        </w:rPr>
+        <w:br/>
+        <w:t xml:space="preserve">                print("Warning!! Purchased Item Quantity is too high.\n")</w:t>
       </w:r>
       <w:r>
         <w:rPr>
@@ -1237,42 +677,14 @@
           <w:rFonts w:ascii="Calibri" w:hAnsi="Calibri" w:cs="Calibri"/>
         </w:rPr>
         <w:br/>
-        <w:t xml:space="preserve">        except </w:t>
-      </w:r>
-      <w:proofErr w:type="spellStart"/>
-      <w:r>
-        <w:rPr>
-          <w:rFonts w:ascii="Calibri" w:hAnsi="Calibri" w:cs="Calibri"/>
-        </w:rPr>
-        <w:t>ValueError</w:t>
-      </w:r>
-      <w:proofErr w:type="spellEnd"/>
-      <w:r>
-        <w:rPr>
-          <w:rFonts w:ascii="Calibri" w:hAnsi="Calibri" w:cs="Calibri"/>
-        </w:rPr>
-        <w:t>:</w:t>
-      </w:r>
-      <w:r>
-        <w:rPr>
-          <w:rFonts w:ascii="Calibri" w:hAnsi="Calibri" w:cs="Calibri"/>
-        </w:rPr>
-        <w:br/>
-        <w:t xml:space="preserve">            </w:t>
-      </w:r>
-      <w:proofErr w:type="gramStart"/>
-      <w:r>
-        <w:rPr>
-          <w:rFonts w:ascii="Calibri" w:hAnsi="Calibri" w:cs="Calibri"/>
-        </w:rPr>
-        <w:t>print(</w:t>
-      </w:r>
-      <w:proofErr w:type="gramEnd"/>
-      <w:r>
-        <w:rPr>
-          <w:rFonts w:ascii="Calibri" w:hAnsi="Calibri" w:cs="Calibri"/>
-        </w:rPr>
-        <w:t>"Warning!! Purchased Item Quantity must be an integer.\n")</w:t>
+        <w:t xml:space="preserve">        except ValueError:</w:t>
+      </w:r>
+      <w:r>
+        <w:rPr>
+          <w:rFonts w:ascii="Calibri" w:hAnsi="Calibri" w:cs="Calibri"/>
+        </w:rPr>
+        <w:br/>
+        <w:t xml:space="preserve">            print("Warning!! Purchased Item Quantity must be an integer.\n")</w:t>
       </w:r>
       <w:r>
         <w:rPr>
@@ -1292,21 +704,7 @@
           <w:rFonts w:ascii="Calibri" w:hAnsi="Calibri" w:cs="Calibri"/>
         </w:rPr>
         <w:br/>
-        <w:t xml:space="preserve">def </w:t>
-      </w:r>
-      <w:proofErr w:type="spellStart"/>
-      <w:r>
-        <w:rPr>
-          <w:rFonts w:ascii="Calibri" w:hAnsi="Calibri" w:cs="Calibri"/>
-        </w:rPr>
-        <w:t>get_valid_item_price</w:t>
-      </w:r>
-      <w:proofErr w:type="spellEnd"/>
-      <w:r>
-        <w:rPr>
-          <w:rFonts w:ascii="Calibri" w:hAnsi="Calibri" w:cs="Calibri"/>
-        </w:rPr>
-        <w:t>():</w:t>
+        <w:t>def get_valid_item_price():</w:t>
       </w:r>
       <w:r>
         <w:rPr>
@@ -1320,21 +718,7 @@
           <w:rFonts w:ascii="Calibri" w:hAnsi="Calibri" w:cs="Calibri"/>
         </w:rPr>
         <w:br/>
-        <w:t xml:space="preserve">        </w:t>
-      </w:r>
-      <w:proofErr w:type="spellStart"/>
-      <w:r>
-        <w:rPr>
-          <w:rFonts w:ascii="Calibri" w:hAnsi="Calibri" w:cs="Calibri"/>
-        </w:rPr>
-        <w:t>item_price</w:t>
-      </w:r>
-      <w:proofErr w:type="spellEnd"/>
-      <w:r>
-        <w:rPr>
-          <w:rFonts w:ascii="Calibri" w:hAnsi="Calibri" w:cs="Calibri"/>
-        </w:rPr>
-        <w:t xml:space="preserve"> = input("Enter Purchased Item Price: \n").strip()</w:t>
+        <w:t xml:space="preserve">        item_price = input("Enter Purchased Item Price: \n").strip()</w:t>
       </w:r>
       <w:r>
         <w:rPr>
@@ -1354,21 +738,7 @@
           <w:rFonts w:ascii="Calibri" w:hAnsi="Calibri" w:cs="Calibri"/>
         </w:rPr>
         <w:br/>
-        <w:t xml:space="preserve">        if </w:t>
-      </w:r>
-      <w:proofErr w:type="spellStart"/>
-      <w:r>
-        <w:rPr>
-          <w:rFonts w:ascii="Calibri" w:hAnsi="Calibri" w:cs="Calibri"/>
-        </w:rPr>
-        <w:t>item_price</w:t>
-      </w:r>
-      <w:proofErr w:type="spellEnd"/>
-      <w:r>
-        <w:rPr>
-          <w:rFonts w:ascii="Calibri" w:hAnsi="Calibri" w:cs="Calibri"/>
-        </w:rPr>
-        <w:t xml:space="preserve"> == "":</w:t>
+        <w:t xml:space="preserve">        if item_price == "":</w:t>
       </w:r>
       <w:r>
         <w:rPr>
@@ -1409,21 +779,7 @@
           <w:rFonts w:ascii="Calibri" w:hAnsi="Calibri" w:cs="Calibri"/>
         </w:rPr>
         <w:br/>
-        <w:t xml:space="preserve">            price = float(</w:t>
-      </w:r>
-      <w:proofErr w:type="spellStart"/>
-      <w:r>
-        <w:rPr>
-          <w:rFonts w:ascii="Calibri" w:hAnsi="Calibri" w:cs="Calibri"/>
-        </w:rPr>
-        <w:t>item_price</w:t>
-      </w:r>
-      <w:proofErr w:type="spellEnd"/>
-      <w:r>
-        <w:rPr>
-          <w:rFonts w:ascii="Calibri" w:hAnsi="Calibri" w:cs="Calibri"/>
-        </w:rPr>
-        <w:t>)</w:t>
+        <w:t xml:space="preserve">            price = float(item_price)</w:t>
       </w:r>
       <w:r>
         <w:rPr>
@@ -1450,21 +806,7 @@
           <w:rFonts w:ascii="Calibri" w:hAnsi="Calibri" w:cs="Calibri"/>
         </w:rPr>
         <w:br/>
-        <w:t xml:space="preserve">                </w:t>
-      </w:r>
-      <w:proofErr w:type="gramStart"/>
-      <w:r>
-        <w:rPr>
-          <w:rFonts w:ascii="Calibri" w:hAnsi="Calibri" w:cs="Calibri"/>
-        </w:rPr>
-        <w:t>print(</w:t>
-      </w:r>
-      <w:proofErr w:type="gramEnd"/>
-      <w:r>
-        <w:rPr>
-          <w:rFonts w:ascii="Calibri" w:hAnsi="Calibri" w:cs="Calibri"/>
-        </w:rPr>
-        <w:t>"Warning!! Purchased Item Price should be greater than 0.\n")</w:t>
+        <w:t xml:space="preserve">                print("Warning!! Purchased Item Price should be greater than 0.\n")</w:t>
       </w:r>
       <w:r>
         <w:rPr>
@@ -1484,69 +826,27 @@
           <w:rFonts w:ascii="Calibri" w:hAnsi="Calibri" w:cs="Calibri"/>
         </w:rPr>
         <w:br/>
-        <w:t xml:space="preserve">                return </w:t>
-      </w:r>
-      <w:proofErr w:type="gramStart"/>
-      <w:r>
-        <w:rPr>
-          <w:rFonts w:ascii="Calibri" w:hAnsi="Calibri" w:cs="Calibri"/>
-        </w:rPr>
-        <w:t>round(</w:t>
-      </w:r>
-      <w:proofErr w:type="gramEnd"/>
-      <w:r>
-        <w:rPr>
-          <w:rFonts w:ascii="Calibri" w:hAnsi="Calibri" w:cs="Calibri"/>
-        </w:rPr>
-        <w:t>price, 2)</w:t>
-      </w:r>
-      <w:r>
-        <w:rPr>
-          <w:rFonts w:ascii="Calibri" w:hAnsi="Calibri" w:cs="Calibri"/>
-        </w:rPr>
-        <w:br/>
-      </w:r>
-      <w:r>
-        <w:rPr>
-          <w:rFonts w:ascii="Calibri" w:hAnsi="Calibri" w:cs="Calibri"/>
-        </w:rPr>
-        <w:br/>
-        <w:t xml:space="preserve">        except </w:t>
-      </w:r>
-      <w:proofErr w:type="spellStart"/>
-      <w:r>
-        <w:rPr>
-          <w:rFonts w:ascii="Calibri" w:hAnsi="Calibri" w:cs="Calibri"/>
-        </w:rPr>
-        <w:t>ValueError</w:t>
-      </w:r>
-      <w:proofErr w:type="spellEnd"/>
-      <w:r>
-        <w:rPr>
-          <w:rFonts w:ascii="Calibri" w:hAnsi="Calibri" w:cs="Calibri"/>
-        </w:rPr>
-        <w:t>:</w:t>
-      </w:r>
-      <w:r>
-        <w:rPr>
-          <w:rFonts w:ascii="Calibri" w:hAnsi="Calibri" w:cs="Calibri"/>
-        </w:rPr>
-        <w:br/>
-        <w:t xml:space="preserve">            </w:t>
-      </w:r>
-      <w:proofErr w:type="gramStart"/>
-      <w:r>
-        <w:rPr>
-          <w:rFonts w:ascii="Calibri" w:hAnsi="Calibri" w:cs="Calibri"/>
-        </w:rPr>
-        <w:t>print(</w:t>
-      </w:r>
-      <w:proofErr w:type="gramEnd"/>
-      <w:r>
-        <w:rPr>
-          <w:rFonts w:ascii="Calibri" w:hAnsi="Calibri" w:cs="Calibri"/>
-        </w:rPr>
-        <w:t>"Warning!! Purchased Item Price must be an integer.\n")</w:t>
+        <w:t xml:space="preserve">                return round(price, 2)</w:t>
+      </w:r>
+      <w:r>
+        <w:rPr>
+          <w:rFonts w:ascii="Calibri" w:hAnsi="Calibri" w:cs="Calibri"/>
+        </w:rPr>
+        <w:br/>
+      </w:r>
+      <w:r>
+        <w:rPr>
+          <w:rFonts w:ascii="Calibri" w:hAnsi="Calibri" w:cs="Calibri"/>
+        </w:rPr>
+        <w:br/>
+        <w:t xml:space="preserve">        except ValueError:</w:t>
+      </w:r>
+      <w:r>
+        <w:rPr>
+          <w:rFonts w:ascii="Calibri" w:hAnsi="Calibri" w:cs="Calibri"/>
+        </w:rPr>
+        <w:br/>
+        <w:t xml:space="preserve">            print("Warning!! Purchased Item Price must be an integer.\n")</w:t>
       </w:r>
       <w:r>
         <w:rPr>
@@ -1566,21 +866,7 @@
           <w:rFonts w:ascii="Calibri" w:hAnsi="Calibri" w:cs="Calibri"/>
         </w:rPr>
         <w:br/>
-        <w:t xml:space="preserve">def </w:t>
-      </w:r>
-      <w:proofErr w:type="spellStart"/>
-      <w:r>
-        <w:rPr>
-          <w:rFonts w:ascii="Calibri" w:hAnsi="Calibri" w:cs="Calibri"/>
-        </w:rPr>
-        <w:t>get_number_of_items</w:t>
-      </w:r>
-      <w:proofErr w:type="spellEnd"/>
-      <w:r>
-        <w:rPr>
-          <w:rFonts w:ascii="Calibri" w:hAnsi="Calibri" w:cs="Calibri"/>
-        </w:rPr>
-        <w:t>():</w:t>
+        <w:t>def get_number_of_items():</w:t>
       </w:r>
       <w:r>
         <w:rPr>
@@ -1601,21 +887,7 @@
           <w:rFonts w:ascii="Calibri" w:hAnsi="Calibri" w:cs="Calibri"/>
         </w:rPr>
         <w:br/>
-        <w:t xml:space="preserve">        </w:t>
-      </w:r>
-      <w:proofErr w:type="spellStart"/>
-      <w:r>
-        <w:rPr>
-          <w:rFonts w:ascii="Calibri" w:hAnsi="Calibri" w:cs="Calibri"/>
-        </w:rPr>
-        <w:t>number_of_items</w:t>
-      </w:r>
-      <w:proofErr w:type="spellEnd"/>
-      <w:r>
-        <w:rPr>
-          <w:rFonts w:ascii="Calibri" w:hAnsi="Calibri" w:cs="Calibri"/>
-        </w:rPr>
-        <w:t xml:space="preserve"> = input("Enter Number of Items Purchased:\n").strip()</w:t>
+        <w:t xml:space="preserve">        number_of_items = input("Enter Number of Items Purchased:\n").strip()</w:t>
       </w:r>
       <w:r>
         <w:rPr>
@@ -1641,21 +913,7 @@
           <w:rFonts w:ascii="Calibri" w:hAnsi="Calibri" w:cs="Calibri"/>
         </w:rPr>
         <w:lastRenderedPageBreak/>
-        <w:t xml:space="preserve">        if </w:t>
-      </w:r>
-      <w:proofErr w:type="spellStart"/>
-      <w:r>
-        <w:rPr>
-          <w:rFonts w:ascii="Calibri" w:hAnsi="Calibri" w:cs="Calibri"/>
-        </w:rPr>
-        <w:t>number_of_items</w:t>
-      </w:r>
-      <w:proofErr w:type="spellEnd"/>
-      <w:r>
-        <w:rPr>
-          <w:rFonts w:ascii="Calibri" w:hAnsi="Calibri" w:cs="Calibri"/>
-        </w:rPr>
-        <w:t xml:space="preserve"> == "":</w:t>
+        <w:t xml:space="preserve">        if number_of_items == "":</w:t>
       </w:r>
       <w:r>
         <w:rPr>
@@ -1689,35 +947,7 @@
           <w:rFonts w:ascii="Calibri" w:hAnsi="Calibri" w:cs="Calibri"/>
         </w:rPr>
         <w:br/>
-        <w:t xml:space="preserve">            </w:t>
-      </w:r>
-      <w:proofErr w:type="spellStart"/>
-      <w:r>
-        <w:rPr>
-          <w:rFonts w:ascii="Calibri" w:hAnsi="Calibri" w:cs="Calibri"/>
-        </w:rPr>
-        <w:t>number_of_items</w:t>
-      </w:r>
-      <w:proofErr w:type="spellEnd"/>
-      <w:r>
-        <w:rPr>
-          <w:rFonts w:ascii="Calibri" w:hAnsi="Calibri" w:cs="Calibri"/>
-        </w:rPr>
-        <w:t xml:space="preserve"> = int(</w:t>
-      </w:r>
-      <w:proofErr w:type="spellStart"/>
-      <w:r>
-        <w:rPr>
-          <w:rFonts w:ascii="Calibri" w:hAnsi="Calibri" w:cs="Calibri"/>
-        </w:rPr>
-        <w:t>number_of_items</w:t>
-      </w:r>
-      <w:proofErr w:type="spellEnd"/>
-      <w:r>
-        <w:rPr>
-          <w:rFonts w:ascii="Calibri" w:hAnsi="Calibri" w:cs="Calibri"/>
-        </w:rPr>
-        <w:t>)</w:t>
+        <w:t xml:space="preserve">            number_of_items = int(number_of_items)</w:t>
       </w:r>
       <w:r>
         <w:rPr>
@@ -1737,42 +967,14 @@
           <w:rFonts w:ascii="Calibri" w:hAnsi="Calibri" w:cs="Calibri"/>
         </w:rPr>
         <w:br/>
-        <w:t xml:space="preserve">            if </w:t>
-      </w:r>
-      <w:proofErr w:type="spellStart"/>
-      <w:r>
-        <w:rPr>
-          <w:rFonts w:ascii="Calibri" w:hAnsi="Calibri" w:cs="Calibri"/>
-        </w:rPr>
-        <w:t>number_of_items</w:t>
-      </w:r>
-      <w:proofErr w:type="spellEnd"/>
-      <w:r>
-        <w:rPr>
-          <w:rFonts w:ascii="Calibri" w:hAnsi="Calibri" w:cs="Calibri"/>
-        </w:rPr>
-        <w:t xml:space="preserve"> &lt;= 0:</w:t>
-      </w:r>
-      <w:r>
-        <w:rPr>
-          <w:rFonts w:ascii="Calibri" w:hAnsi="Calibri" w:cs="Calibri"/>
-        </w:rPr>
-        <w:br/>
-        <w:t xml:space="preserve">                </w:t>
-      </w:r>
-      <w:proofErr w:type="gramStart"/>
-      <w:r>
-        <w:rPr>
-          <w:rFonts w:ascii="Calibri" w:hAnsi="Calibri" w:cs="Calibri"/>
-        </w:rPr>
-        <w:t>print(</w:t>
-      </w:r>
-      <w:proofErr w:type="gramEnd"/>
-      <w:r>
-        <w:rPr>
-          <w:rFonts w:ascii="Calibri" w:hAnsi="Calibri" w:cs="Calibri"/>
-        </w:rPr>
-        <w:t>"Warning!! Purchased Number of Items should be greater than 0.\n")</w:t>
+        <w:t xml:space="preserve">            if number_of_items &lt;= 0:</w:t>
+      </w:r>
+      <w:r>
+        <w:rPr>
+          <w:rFonts w:ascii="Calibri" w:hAnsi="Calibri" w:cs="Calibri"/>
+        </w:rPr>
+        <w:br/>
+        <w:t xml:space="preserve">                print("Warning!! Purchased Number of Items should be greater than 0.\n")</w:t>
       </w:r>
       <w:r>
         <w:rPr>
@@ -1792,56 +994,14 @@
           <w:rFonts w:ascii="Calibri" w:hAnsi="Calibri" w:cs="Calibri"/>
         </w:rPr>
         <w:br/>
-        <w:t xml:space="preserve">            </w:t>
-      </w:r>
-      <w:proofErr w:type="spellStart"/>
-      <w:r>
-        <w:rPr>
-          <w:rFonts w:ascii="Calibri" w:hAnsi="Calibri" w:cs="Calibri"/>
-        </w:rPr>
-        <w:t>elif</w:t>
-      </w:r>
-      <w:proofErr w:type="spellEnd"/>
-      <w:r>
-        <w:rPr>
-          <w:rFonts w:ascii="Calibri" w:hAnsi="Calibri" w:cs="Calibri"/>
-        </w:rPr>
-        <w:t xml:space="preserve"> </w:t>
-      </w:r>
-      <w:proofErr w:type="spellStart"/>
-      <w:r>
-        <w:rPr>
-          <w:rFonts w:ascii="Calibri" w:hAnsi="Calibri" w:cs="Calibri"/>
-        </w:rPr>
-        <w:t>number_of_items</w:t>
-      </w:r>
-      <w:proofErr w:type="spellEnd"/>
-      <w:r>
-        <w:rPr>
-          <w:rFonts w:ascii="Calibri" w:hAnsi="Calibri" w:cs="Calibri"/>
-        </w:rPr>
-        <w:t xml:space="preserve"> &gt; 100:</w:t>
-      </w:r>
-      <w:r>
-        <w:rPr>
-          <w:rFonts w:ascii="Calibri" w:hAnsi="Calibri" w:cs="Calibri"/>
-        </w:rPr>
-        <w:br/>
-        <w:t xml:space="preserve">                </w:t>
-      </w:r>
-      <w:proofErr w:type="gramStart"/>
-      <w:r>
-        <w:rPr>
-          <w:rFonts w:ascii="Calibri" w:hAnsi="Calibri" w:cs="Calibri"/>
-        </w:rPr>
-        <w:t>print(</w:t>
-      </w:r>
-      <w:proofErr w:type="gramEnd"/>
-      <w:r>
-        <w:rPr>
-          <w:rFonts w:ascii="Calibri" w:hAnsi="Calibri" w:cs="Calibri"/>
-        </w:rPr>
-        <w:t>"Warning!! Purchased Number of Items are too many.\n")</w:t>
+        <w:t xml:space="preserve">            elif number_of_items &gt; 100:</w:t>
+      </w:r>
+      <w:r>
+        <w:rPr>
+          <w:rFonts w:ascii="Calibri" w:hAnsi="Calibri" w:cs="Calibri"/>
+        </w:rPr>
+        <w:br/>
+        <w:t xml:space="preserve">                print("Warning!! Purchased Number of Items are too many.\n")</w:t>
       </w:r>
       <w:r>
         <w:rPr>
@@ -1861,63 +1021,27 @@
           <w:rFonts w:ascii="Calibri" w:hAnsi="Calibri" w:cs="Calibri"/>
         </w:rPr>
         <w:br/>
-        <w:t xml:space="preserve">                return </w:t>
-      </w:r>
-      <w:proofErr w:type="spellStart"/>
-      <w:r>
-        <w:rPr>
-          <w:rFonts w:ascii="Calibri" w:hAnsi="Calibri" w:cs="Calibri"/>
-        </w:rPr>
-        <w:t>number_of_items</w:t>
-      </w:r>
-      <w:proofErr w:type="spellEnd"/>
-      <w:r>
-        <w:rPr>
-          <w:rFonts w:ascii="Calibri" w:hAnsi="Calibri" w:cs="Calibri"/>
-        </w:rPr>
-        <w:br/>
-      </w:r>
-      <w:r>
-        <w:rPr>
-          <w:rFonts w:ascii="Calibri" w:hAnsi="Calibri" w:cs="Calibri"/>
-        </w:rPr>
-        <w:br/>
-        <w:t xml:space="preserve">        except </w:t>
-      </w:r>
-      <w:proofErr w:type="spellStart"/>
-      <w:r>
-        <w:rPr>
-          <w:rFonts w:ascii="Calibri" w:hAnsi="Calibri" w:cs="Calibri"/>
-        </w:rPr>
-        <w:t>ValueError</w:t>
-      </w:r>
-      <w:proofErr w:type="spellEnd"/>
-      <w:r>
-        <w:rPr>
-          <w:rFonts w:ascii="Calibri" w:hAnsi="Calibri" w:cs="Calibri"/>
-        </w:rPr>
-        <w:t>:</w:t>
-      </w:r>
-      <w:r>
-        <w:rPr>
-          <w:rFonts w:ascii="Calibri" w:hAnsi="Calibri" w:cs="Calibri"/>
-        </w:rPr>
-        <w:br/>
-        <w:t xml:space="preserve">            </w:t>
-      </w:r>
-      <w:proofErr w:type="gramStart"/>
-      <w:r>
-        <w:rPr>
-          <w:rFonts w:ascii="Calibri" w:hAnsi="Calibri" w:cs="Calibri"/>
-        </w:rPr>
-        <w:t>print(</w:t>
-      </w:r>
-      <w:proofErr w:type="gramEnd"/>
-      <w:r>
-        <w:rPr>
-          <w:rFonts w:ascii="Calibri" w:hAnsi="Calibri" w:cs="Calibri"/>
-        </w:rPr>
-        <w:t>"Warning!! Purchased Number of Items must be an integer.\n")</w:t>
+        <w:t xml:space="preserve">                return number_of_items</w:t>
+      </w:r>
+      <w:r>
+        <w:rPr>
+          <w:rFonts w:ascii="Calibri" w:hAnsi="Calibri" w:cs="Calibri"/>
+        </w:rPr>
+        <w:br/>
+      </w:r>
+      <w:r>
+        <w:rPr>
+          <w:rFonts w:ascii="Calibri" w:hAnsi="Calibri" w:cs="Calibri"/>
+        </w:rPr>
+        <w:br/>
+        <w:t xml:space="preserve">        except ValueError:</w:t>
+      </w:r>
+      <w:r>
+        <w:rPr>
+          <w:rFonts w:ascii="Calibri" w:hAnsi="Calibri" w:cs="Calibri"/>
+        </w:rPr>
+        <w:br/>
+        <w:t xml:space="preserve">            print("Warning!! Purchased Number of Items must be an integer.\n")</w:t>
       </w:r>
       <w:r>
         <w:rPr>
@@ -1937,200 +1061,60 @@
           <w:rFonts w:ascii="Calibri" w:hAnsi="Calibri" w:cs="Calibri"/>
         </w:rPr>
         <w:br/>
-        <w:t xml:space="preserve">def </w:t>
-      </w:r>
-      <w:proofErr w:type="spellStart"/>
-      <w:r>
-        <w:rPr>
-          <w:rFonts w:ascii="Calibri" w:hAnsi="Calibri" w:cs="Calibri"/>
-        </w:rPr>
-        <w:t>get_item_details</w:t>
-      </w:r>
-      <w:proofErr w:type="spellEnd"/>
-      <w:r>
-        <w:rPr>
-          <w:rFonts w:ascii="Calibri" w:hAnsi="Calibri" w:cs="Calibri"/>
-        </w:rPr>
-        <w:t>(</w:t>
-      </w:r>
-      <w:proofErr w:type="spellStart"/>
-      <w:r>
-        <w:rPr>
-          <w:rFonts w:ascii="Calibri" w:hAnsi="Calibri" w:cs="Calibri"/>
-        </w:rPr>
-        <w:t>item_number</w:t>
-      </w:r>
-      <w:proofErr w:type="spellEnd"/>
-      <w:r>
-        <w:rPr>
-          <w:rFonts w:ascii="Calibri" w:hAnsi="Calibri" w:cs="Calibri"/>
-        </w:rPr>
-        <w:t xml:space="preserve">, </w:t>
-      </w:r>
-      <w:proofErr w:type="spellStart"/>
-      <w:r>
-        <w:rPr>
-          <w:rFonts w:ascii="Calibri" w:hAnsi="Calibri" w:cs="Calibri"/>
-        </w:rPr>
-        <w:t>existing_items</w:t>
-      </w:r>
-      <w:proofErr w:type="spellEnd"/>
-      <w:r>
-        <w:rPr>
-          <w:rFonts w:ascii="Calibri" w:hAnsi="Calibri" w:cs="Calibri"/>
-        </w:rPr>
-        <w:t>):</w:t>
-      </w:r>
-      <w:r>
-        <w:rPr>
-          <w:rFonts w:ascii="Calibri" w:hAnsi="Calibri" w:cs="Calibri"/>
-        </w:rPr>
-        <w:br/>
-      </w:r>
-      <w:r>
-        <w:rPr>
-          <w:rFonts w:ascii="Calibri" w:hAnsi="Calibri" w:cs="Calibri"/>
-        </w:rPr>
-        <w:br/>
-        <w:t xml:space="preserve">    print(f"\</w:t>
-      </w:r>
-      <w:proofErr w:type="spellStart"/>
-      <w:r>
-        <w:rPr>
-          <w:rFonts w:ascii="Calibri" w:hAnsi="Calibri" w:cs="Calibri"/>
-        </w:rPr>
-        <w:t>nItem</w:t>
-      </w:r>
-      <w:proofErr w:type="spellEnd"/>
-      <w:r>
-        <w:rPr>
-          <w:rFonts w:ascii="Calibri" w:hAnsi="Calibri" w:cs="Calibri"/>
-        </w:rPr>
-        <w:t xml:space="preserve"> {</w:t>
-      </w:r>
-      <w:proofErr w:type="spellStart"/>
-      <w:r>
-        <w:rPr>
-          <w:rFonts w:ascii="Calibri" w:hAnsi="Calibri" w:cs="Calibri"/>
-        </w:rPr>
-        <w:t>item_number</w:t>
-      </w:r>
-      <w:proofErr w:type="spellEnd"/>
-      <w:r>
-        <w:rPr>
-          <w:rFonts w:ascii="Calibri" w:hAnsi="Calibri" w:cs="Calibri"/>
-        </w:rPr>
-        <w:t>} \n")</w:t>
-      </w:r>
-      <w:r>
-        <w:rPr>
-          <w:rFonts w:ascii="Calibri" w:hAnsi="Calibri" w:cs="Calibri"/>
-        </w:rPr>
-        <w:br/>
-      </w:r>
-      <w:r>
-        <w:rPr>
-          <w:rFonts w:ascii="Calibri" w:hAnsi="Calibri" w:cs="Calibri"/>
-        </w:rPr>
-        <w:br/>
-        <w:t xml:space="preserve">    name = </w:t>
-      </w:r>
-      <w:proofErr w:type="spellStart"/>
-      <w:r>
-        <w:rPr>
-          <w:rFonts w:ascii="Calibri" w:hAnsi="Calibri" w:cs="Calibri"/>
-        </w:rPr>
-        <w:t>get_valid_item_name</w:t>
-      </w:r>
-      <w:proofErr w:type="spellEnd"/>
-      <w:r>
-        <w:rPr>
-          <w:rFonts w:ascii="Calibri" w:hAnsi="Calibri" w:cs="Calibri"/>
-        </w:rPr>
-        <w:t>(</w:t>
-      </w:r>
-      <w:proofErr w:type="spellStart"/>
-      <w:r>
-        <w:rPr>
-          <w:rFonts w:ascii="Calibri" w:hAnsi="Calibri" w:cs="Calibri"/>
-        </w:rPr>
-        <w:t>existing_items</w:t>
-      </w:r>
-      <w:proofErr w:type="spellEnd"/>
-      <w:r>
-        <w:rPr>
-          <w:rFonts w:ascii="Calibri" w:hAnsi="Calibri" w:cs="Calibri"/>
-        </w:rPr>
-        <w:t>)</w:t>
-      </w:r>
-      <w:r>
-        <w:rPr>
-          <w:rFonts w:ascii="Calibri" w:hAnsi="Calibri" w:cs="Calibri"/>
-        </w:rPr>
-        <w:br/>
-        <w:t xml:space="preserve">    quantity = </w:t>
-      </w:r>
-      <w:proofErr w:type="spellStart"/>
-      <w:r>
-        <w:rPr>
-          <w:rFonts w:ascii="Calibri" w:hAnsi="Calibri" w:cs="Calibri"/>
-        </w:rPr>
-        <w:t>get_valid_item_quantity</w:t>
-      </w:r>
-      <w:proofErr w:type="spellEnd"/>
-      <w:r>
-        <w:rPr>
-          <w:rFonts w:ascii="Calibri" w:hAnsi="Calibri" w:cs="Calibri"/>
-        </w:rPr>
-        <w:t>()</w:t>
-      </w:r>
-      <w:r>
-        <w:rPr>
-          <w:rFonts w:ascii="Calibri" w:hAnsi="Calibri" w:cs="Calibri"/>
-        </w:rPr>
-        <w:br/>
-        <w:t xml:space="preserve">    price = </w:t>
-      </w:r>
-      <w:proofErr w:type="spellStart"/>
-      <w:r>
-        <w:rPr>
-          <w:rFonts w:ascii="Calibri" w:hAnsi="Calibri" w:cs="Calibri"/>
-        </w:rPr>
-        <w:t>get_valid_item_price</w:t>
-      </w:r>
-      <w:proofErr w:type="spellEnd"/>
-      <w:r>
-        <w:rPr>
-          <w:rFonts w:ascii="Calibri" w:hAnsi="Calibri" w:cs="Calibri"/>
-        </w:rPr>
-        <w:t>()</w:t>
-      </w:r>
-      <w:r>
-        <w:rPr>
-          <w:rFonts w:ascii="Calibri" w:hAnsi="Calibri" w:cs="Calibri"/>
-        </w:rPr>
-        <w:br/>
-      </w:r>
-      <w:r>
-        <w:rPr>
-          <w:rFonts w:ascii="Calibri" w:hAnsi="Calibri" w:cs="Calibri"/>
-        </w:rPr>
-        <w:br/>
-        <w:t xml:space="preserve">    return </w:t>
-      </w:r>
-      <w:proofErr w:type="spellStart"/>
-      <w:r>
-        <w:rPr>
-          <w:rFonts w:ascii="Calibri" w:hAnsi="Calibri" w:cs="Calibri"/>
-        </w:rPr>
-        <w:t>ItemToPurchase</w:t>
-      </w:r>
-      <w:proofErr w:type="spellEnd"/>
-      <w:r>
-        <w:rPr>
-          <w:rFonts w:ascii="Calibri" w:hAnsi="Calibri" w:cs="Calibri"/>
-        </w:rPr>
-        <w:t>(name, price, quantity)</w:t>
+        <w:t>def get_item_details(item_number, existing_items):</w:t>
+      </w:r>
+      <w:r>
+        <w:rPr>
+          <w:rFonts w:ascii="Calibri" w:hAnsi="Calibri" w:cs="Calibri"/>
+        </w:rPr>
+        <w:br/>
+      </w:r>
+      <w:r>
+        <w:rPr>
+          <w:rFonts w:ascii="Calibri" w:hAnsi="Calibri" w:cs="Calibri"/>
+        </w:rPr>
+        <w:br/>
+        <w:t xml:space="preserve">    print(f"\nItem {item_number} \n")</w:t>
+      </w:r>
+      <w:r>
+        <w:rPr>
+          <w:rFonts w:ascii="Calibri" w:hAnsi="Calibri" w:cs="Calibri"/>
+        </w:rPr>
+        <w:br/>
+      </w:r>
+      <w:r>
+        <w:rPr>
+          <w:rFonts w:ascii="Calibri" w:hAnsi="Calibri" w:cs="Calibri"/>
+        </w:rPr>
+        <w:br/>
+        <w:t xml:space="preserve">    name = get_valid_item_name(existing_items)</w:t>
+      </w:r>
+      <w:r>
+        <w:rPr>
+          <w:rFonts w:ascii="Calibri" w:hAnsi="Calibri" w:cs="Calibri"/>
+        </w:rPr>
+        <w:br/>
+        <w:t xml:space="preserve">    quantity = get_valid_item_quantity()</w:t>
+      </w:r>
+      <w:r>
+        <w:rPr>
+          <w:rFonts w:ascii="Calibri" w:hAnsi="Calibri" w:cs="Calibri"/>
+        </w:rPr>
+        <w:br/>
+        <w:t xml:space="preserve">    price = get_valid_item_price()</w:t>
+      </w:r>
+      <w:r>
+        <w:rPr>
+          <w:rFonts w:ascii="Calibri" w:hAnsi="Calibri" w:cs="Calibri"/>
+        </w:rPr>
+        <w:br/>
+      </w:r>
+      <w:r>
+        <w:rPr>
+          <w:rFonts w:ascii="Calibri" w:hAnsi="Calibri" w:cs="Calibri"/>
+        </w:rPr>
+        <w:br/>
+        <w:t xml:space="preserve">    return ItemToPurchase(name, price, quantity)</w:t>
       </w:r>
       <w:r>
         <w:rPr>
@@ -2169,62 +1153,20 @@
           <w:rFonts w:ascii="Calibri" w:hAnsi="Calibri" w:cs="Calibri"/>
         </w:rPr>
         <w:br/>
-        <w:t xml:space="preserve">    </w:t>
-      </w:r>
-      <w:proofErr w:type="spellStart"/>
-      <w:r>
-        <w:rPr>
-          <w:rFonts w:ascii="Calibri" w:hAnsi="Calibri" w:cs="Calibri"/>
-        </w:rPr>
-        <w:t>existing_items</w:t>
-      </w:r>
-      <w:proofErr w:type="spellEnd"/>
-      <w:r>
-        <w:rPr>
-          <w:rFonts w:ascii="Calibri" w:hAnsi="Calibri" w:cs="Calibri"/>
-        </w:rPr>
-        <w:t xml:space="preserve"> = set()</w:t>
-      </w:r>
-      <w:r>
-        <w:rPr>
-          <w:rFonts w:ascii="Calibri" w:hAnsi="Calibri" w:cs="Calibri"/>
-        </w:rPr>
-        <w:br/>
-      </w:r>
-      <w:r>
-        <w:rPr>
-          <w:rFonts w:ascii="Calibri" w:hAnsi="Calibri" w:cs="Calibri"/>
-        </w:rPr>
-        <w:br/>
-        <w:t xml:space="preserve">    </w:t>
-      </w:r>
-      <w:proofErr w:type="spellStart"/>
-      <w:r>
-        <w:rPr>
-          <w:rFonts w:ascii="Calibri" w:hAnsi="Calibri" w:cs="Calibri"/>
-        </w:rPr>
-        <w:t>number_of_items</w:t>
-      </w:r>
-      <w:proofErr w:type="spellEnd"/>
-      <w:r>
-        <w:rPr>
-          <w:rFonts w:ascii="Calibri" w:hAnsi="Calibri" w:cs="Calibri"/>
-        </w:rPr>
-        <w:t xml:space="preserve"> = </w:t>
-      </w:r>
-      <w:proofErr w:type="spellStart"/>
-      <w:r>
-        <w:rPr>
-          <w:rFonts w:ascii="Calibri" w:hAnsi="Calibri" w:cs="Calibri"/>
-        </w:rPr>
-        <w:t>get_number_of_items</w:t>
-      </w:r>
-      <w:proofErr w:type="spellEnd"/>
-      <w:r>
-        <w:rPr>
-          <w:rFonts w:ascii="Calibri" w:hAnsi="Calibri" w:cs="Calibri"/>
-        </w:rPr>
-        <w:t>()</w:t>
+        <w:t xml:space="preserve">    existing_items = set()</w:t>
+      </w:r>
+      <w:r>
+        <w:rPr>
+          <w:rFonts w:ascii="Calibri" w:hAnsi="Calibri" w:cs="Calibri"/>
+        </w:rPr>
+        <w:br/>
+      </w:r>
+      <w:r>
+        <w:rPr>
+          <w:rFonts w:ascii="Calibri" w:hAnsi="Calibri" w:cs="Calibri"/>
+        </w:rPr>
+        <w:br/>
+        <w:t xml:space="preserve">    number_of_items = get_number_of_items()</w:t>
       </w:r>
       <w:r>
         <w:rPr>
@@ -2238,105 +1180,21 @@
         </w:rPr>
         <w:lastRenderedPageBreak/>
         <w:br/>
-        <w:t xml:space="preserve">    for </w:t>
-      </w:r>
-      <w:proofErr w:type="spellStart"/>
-      <w:r>
-        <w:rPr>
-          <w:rFonts w:ascii="Calibri" w:hAnsi="Calibri" w:cs="Calibri"/>
-        </w:rPr>
-        <w:t>i</w:t>
-      </w:r>
-      <w:proofErr w:type="spellEnd"/>
-      <w:r>
-        <w:rPr>
-          <w:rFonts w:ascii="Calibri" w:hAnsi="Calibri" w:cs="Calibri"/>
-        </w:rPr>
-        <w:t xml:space="preserve"> in range(1, </w:t>
-      </w:r>
-      <w:proofErr w:type="spellStart"/>
-      <w:r>
-        <w:rPr>
-          <w:rFonts w:ascii="Calibri" w:hAnsi="Calibri" w:cs="Calibri"/>
-        </w:rPr>
-        <w:t>number_of_items</w:t>
-      </w:r>
-      <w:proofErr w:type="spellEnd"/>
-      <w:r>
-        <w:rPr>
-          <w:rFonts w:ascii="Calibri" w:hAnsi="Calibri" w:cs="Calibri"/>
-        </w:rPr>
-        <w:t xml:space="preserve"> + 1):</w:t>
-      </w:r>
-      <w:r>
-        <w:rPr>
-          <w:rFonts w:ascii="Calibri" w:hAnsi="Calibri" w:cs="Calibri"/>
-        </w:rPr>
-        <w:br/>
-        <w:t xml:space="preserve">        item = </w:t>
-      </w:r>
-      <w:proofErr w:type="spellStart"/>
-      <w:r>
-        <w:rPr>
-          <w:rFonts w:ascii="Calibri" w:hAnsi="Calibri" w:cs="Calibri"/>
-        </w:rPr>
-        <w:t>get_item_details</w:t>
-      </w:r>
-      <w:proofErr w:type="spellEnd"/>
-      <w:r>
-        <w:rPr>
-          <w:rFonts w:ascii="Calibri" w:hAnsi="Calibri" w:cs="Calibri"/>
-        </w:rPr>
-        <w:t>(</w:t>
-      </w:r>
-      <w:proofErr w:type="spellStart"/>
-      <w:r>
-        <w:rPr>
-          <w:rFonts w:ascii="Calibri" w:hAnsi="Calibri" w:cs="Calibri"/>
-        </w:rPr>
-        <w:t>i</w:t>
-      </w:r>
-      <w:proofErr w:type="spellEnd"/>
-      <w:r>
-        <w:rPr>
-          <w:rFonts w:ascii="Calibri" w:hAnsi="Calibri" w:cs="Calibri"/>
-        </w:rPr>
-        <w:t xml:space="preserve">, </w:t>
-      </w:r>
-      <w:proofErr w:type="spellStart"/>
-      <w:r>
-        <w:rPr>
-          <w:rFonts w:ascii="Calibri" w:hAnsi="Calibri" w:cs="Calibri"/>
-        </w:rPr>
-        <w:t>existing_items</w:t>
-      </w:r>
-      <w:proofErr w:type="spellEnd"/>
-      <w:r>
-        <w:rPr>
-          <w:rFonts w:ascii="Calibri" w:hAnsi="Calibri" w:cs="Calibri"/>
-        </w:rPr>
-        <w:t>)</w:t>
-      </w:r>
-      <w:r>
-        <w:rPr>
-          <w:rFonts w:ascii="Calibri" w:hAnsi="Calibri" w:cs="Calibri"/>
-        </w:rPr>
-        <w:br/>
-        <w:t xml:space="preserve">        </w:t>
-      </w:r>
-      <w:proofErr w:type="spellStart"/>
-      <w:r>
-        <w:rPr>
-          <w:rFonts w:ascii="Calibri" w:hAnsi="Calibri" w:cs="Calibri"/>
-        </w:rPr>
-        <w:t>items.append</w:t>
-      </w:r>
-      <w:proofErr w:type="spellEnd"/>
-      <w:r>
-        <w:rPr>
-          <w:rFonts w:ascii="Calibri" w:hAnsi="Calibri" w:cs="Calibri"/>
-        </w:rPr>
-        <w:t>(item)</w:t>
+        <w:t xml:space="preserve">    for i in range(1, number_of_items + 1):</w:t>
+      </w:r>
+      <w:r>
+        <w:rPr>
+          <w:rFonts w:ascii="Calibri" w:hAnsi="Calibri" w:cs="Calibri"/>
+        </w:rPr>
+        <w:br/>
+        <w:t xml:space="preserve">        item = get_item_details(i, existing_items)</w:t>
+      </w:r>
+      <w:r>
+        <w:rPr>
+          <w:rFonts w:ascii="Calibri" w:hAnsi="Calibri" w:cs="Calibri"/>
+        </w:rPr>
+        <w:br/>
+        <w:t xml:space="preserve">        items.append(item)</w:t>
       </w:r>
       <w:r>
         <w:rPr>
@@ -2362,21 +1220,7 @@
           <w:rFonts w:ascii="Calibri" w:hAnsi="Calibri" w:cs="Calibri"/>
         </w:rPr>
         <w:br/>
-        <w:t xml:space="preserve">    </w:t>
-      </w:r>
-      <w:proofErr w:type="spellStart"/>
-      <w:r>
-        <w:rPr>
-          <w:rFonts w:ascii="Calibri" w:hAnsi="Calibri" w:cs="Calibri"/>
-        </w:rPr>
-        <w:t>total_cost</w:t>
-      </w:r>
-      <w:proofErr w:type="spellEnd"/>
-      <w:r>
-        <w:rPr>
-          <w:rFonts w:ascii="Calibri" w:hAnsi="Calibri" w:cs="Calibri"/>
-        </w:rPr>
-        <w:t xml:space="preserve"> = 0</w:t>
+        <w:t xml:space="preserve">    total_cost = 0</w:t>
       </w:r>
       <w:r>
         <w:rPr>
@@ -2396,105 +1240,27 @@
           <w:rFonts w:ascii="Calibri" w:hAnsi="Calibri" w:cs="Calibri"/>
         </w:rPr>
         <w:br/>
-        <w:t xml:space="preserve">        </w:t>
-      </w:r>
-      <w:proofErr w:type="spellStart"/>
-      <w:r>
-        <w:rPr>
-          <w:rFonts w:ascii="Calibri" w:hAnsi="Calibri" w:cs="Calibri"/>
-        </w:rPr>
-        <w:t>item.print_item_cost</w:t>
-      </w:r>
-      <w:proofErr w:type="spellEnd"/>
-      <w:r>
-        <w:rPr>
-          <w:rFonts w:ascii="Calibri" w:hAnsi="Calibri" w:cs="Calibri"/>
-        </w:rPr>
-        <w:t>()</w:t>
-      </w:r>
-      <w:r>
-        <w:rPr>
-          <w:rFonts w:ascii="Calibri" w:hAnsi="Calibri" w:cs="Calibri"/>
-        </w:rPr>
-        <w:br/>
-        <w:t xml:space="preserve">        </w:t>
-      </w:r>
-      <w:proofErr w:type="spellStart"/>
-      <w:r>
-        <w:rPr>
-          <w:rFonts w:ascii="Calibri" w:hAnsi="Calibri" w:cs="Calibri"/>
-        </w:rPr>
-        <w:t>total_cost</w:t>
-      </w:r>
-      <w:proofErr w:type="spellEnd"/>
-      <w:r>
-        <w:rPr>
-          <w:rFonts w:ascii="Calibri" w:hAnsi="Calibri" w:cs="Calibri"/>
-        </w:rPr>
-        <w:t xml:space="preserve"> += </w:t>
-      </w:r>
-      <w:proofErr w:type="spellStart"/>
-      <w:r>
-        <w:rPr>
-          <w:rFonts w:ascii="Calibri" w:hAnsi="Calibri" w:cs="Calibri"/>
-        </w:rPr>
-        <w:t>item.itemPrice</w:t>
-      </w:r>
-      <w:proofErr w:type="spellEnd"/>
-      <w:r>
-        <w:rPr>
-          <w:rFonts w:ascii="Calibri" w:hAnsi="Calibri" w:cs="Calibri"/>
-        </w:rPr>
-        <w:t xml:space="preserve"> * </w:t>
-      </w:r>
-      <w:proofErr w:type="spellStart"/>
-      <w:r>
-        <w:rPr>
-          <w:rFonts w:ascii="Calibri" w:hAnsi="Calibri" w:cs="Calibri"/>
-        </w:rPr>
-        <w:t>item.itemQuantity</w:t>
-      </w:r>
-      <w:proofErr w:type="spellEnd"/>
-      <w:r>
-        <w:rPr>
-          <w:rFonts w:ascii="Calibri" w:hAnsi="Calibri" w:cs="Calibri"/>
-        </w:rPr>
-        <w:br/>
-      </w:r>
-      <w:r>
-        <w:rPr>
-          <w:rFonts w:ascii="Calibri" w:hAnsi="Calibri" w:cs="Calibri"/>
-        </w:rPr>
-        <w:br/>
-        <w:t xml:space="preserve">    print(f"\</w:t>
-      </w:r>
-      <w:proofErr w:type="spellStart"/>
-      <w:r>
-        <w:rPr>
-          <w:rFonts w:ascii="Calibri" w:hAnsi="Calibri" w:cs="Calibri"/>
-        </w:rPr>
-        <w:t>nTotal</w:t>
-      </w:r>
-      <w:proofErr w:type="spellEnd"/>
-      <w:r>
-        <w:rPr>
-          <w:rFonts w:ascii="Calibri" w:hAnsi="Calibri" w:cs="Calibri"/>
-        </w:rPr>
-        <w:t>: ${round(</w:t>
-      </w:r>
-      <w:proofErr w:type="spellStart"/>
-      <w:r>
-        <w:rPr>
-          <w:rFonts w:ascii="Calibri" w:hAnsi="Calibri" w:cs="Calibri"/>
-        </w:rPr>
-        <w:t>total_cost</w:t>
-      </w:r>
-      <w:proofErr w:type="spellEnd"/>
-      <w:r>
-        <w:rPr>
-          <w:rFonts w:ascii="Calibri" w:hAnsi="Calibri" w:cs="Calibri"/>
-        </w:rPr>
-        <w:t>, 2)}\n")</w:t>
+        <w:t xml:space="preserve">        item.print_item_cost()</w:t>
+      </w:r>
+      <w:r>
+        <w:rPr>
+          <w:rFonts w:ascii="Calibri" w:hAnsi="Calibri" w:cs="Calibri"/>
+        </w:rPr>
+        <w:br/>
+        <w:t xml:space="preserve">        total_cost += item.itemPrice * item.itemQuantity</w:t>
+      </w:r>
+      <w:r>
+        <w:rPr>
+          <w:rFonts w:ascii="Calibri" w:hAnsi="Calibri" w:cs="Calibri"/>
+        </w:rPr>
+        <w:br/>
+      </w:r>
+      <w:r>
+        <w:rPr>
+          <w:rFonts w:ascii="Calibri" w:hAnsi="Calibri" w:cs="Calibri"/>
+        </w:rPr>
+        <w:br/>
+        <w:t xml:space="preserve">    print(f"\nTotal: ${round(total_cost, 2)}\n")</w:t>
       </w:r>
       <w:r>
         <w:rPr>
@@ -2546,6 +1312,7 @@
       <w:r>
         <w:rPr>
           <w:rFonts w:ascii="Calibri" w:hAnsi="Calibri" w:cs="Calibri"/>
+          <w:noProof/>
         </w:rPr>
         <w:drawing>
           <wp:inline distT="0" distB="0" distL="0" distR="0" wp14:anchorId="596E5D82" wp14:editId="2C97BA6A">
@@ -2600,6 +1367,7 @@
       <w:r>
         <w:rPr>
           <w:rFonts w:ascii="Calibri" w:hAnsi="Calibri" w:cs="Calibri"/>
+          <w:noProof/>
         </w:rPr>
         <w:drawing>
           <wp:inline distT="0" distB="0" distL="0" distR="0" wp14:anchorId="19D6E470" wp14:editId="016A1FB5">
@@ -2661,6 +1429,7 @@
       <w:r>
         <w:rPr>
           <w:rFonts w:ascii="Calibri" w:hAnsi="Calibri" w:cs="Calibri"/>
+          <w:noProof/>
         </w:rPr>
         <w:drawing>
           <wp:inline distT="0" distB="0" distL="0" distR="0" wp14:anchorId="705E37B2" wp14:editId="239FA71B">
@@ -2715,6 +1484,7 @@
       <w:r>
         <w:rPr>
           <w:rFonts w:ascii="Calibri" w:hAnsi="Calibri" w:cs="Calibri"/>
+          <w:noProof/>
         </w:rPr>
         <w:drawing>
           <wp:inline distT="0" distB="0" distL="0" distR="0" wp14:anchorId="7DAE492E" wp14:editId="1C1BBDF3">
@@ -2776,6 +1546,7 @@
       <w:r>
         <w:rPr>
           <w:rFonts w:ascii="Calibri" w:hAnsi="Calibri" w:cs="Calibri"/>
+          <w:noProof/>
         </w:rPr>
         <w:drawing>
           <wp:inline distT="0" distB="0" distL="0" distR="0" wp14:anchorId="483B9F48" wp14:editId="22D67B7C">
@@ -2830,6 +1601,7 @@
       <w:r>
         <w:rPr>
           <w:rFonts w:ascii="Calibri" w:hAnsi="Calibri" w:cs="Calibri"/>
+          <w:noProof/>
         </w:rPr>
         <w:drawing>
           <wp:inline distT="0" distB="0" distL="0" distR="0" wp14:anchorId="443121B2" wp14:editId="6FA3AFE7">
@@ -3005,6 +1777,7 @@
       <w:r>
         <w:rPr>
           <w:rFonts w:ascii="Calibri" w:hAnsi="Calibri" w:cs="Calibri"/>
+          <w:noProof/>
         </w:rPr>
         <w:drawing>
           <wp:inline distT="0" distB="0" distL="0" distR="0" wp14:anchorId="7E2AF0E9" wp14:editId="2C609A00">
@@ -3124,13 +1897,7 @@
         <w:rPr>
           <w:rFonts w:ascii="Calibri" w:hAnsi="Calibri" w:cs="Calibri"/>
         </w:rPr>
-        <w:t>number of items</w:t>
-      </w:r>
-      <w:r>
-        <w:rPr>
-          <w:rFonts w:ascii="Calibri" w:hAnsi="Calibri" w:cs="Calibri"/>
-        </w:rPr>
-        <w:t xml:space="preserve"> </w:t>
+        <w:t xml:space="preserve">number of items </w:t>
       </w:r>
       <w:r>
         <w:rPr>
@@ -3148,6 +1915,7 @@
       <w:r>
         <w:rPr>
           <w:rFonts w:ascii="Calibri" w:hAnsi="Calibri" w:cs="Calibri"/>
+          <w:noProof/>
         </w:rPr>
         <w:drawing>
           <wp:inline distT="0" distB="0" distL="0" distR="0" wp14:anchorId="421EACBD" wp14:editId="4C7FAA8B">
@@ -3246,13 +2014,7 @@
         <w:rPr>
           <w:rFonts w:ascii="Calibri" w:hAnsi="Calibri" w:cs="Calibri"/>
         </w:rPr>
-        <w:t>number of items</w:t>
-      </w:r>
-      <w:r>
-        <w:rPr>
-          <w:rFonts w:ascii="Calibri" w:hAnsi="Calibri" w:cs="Calibri"/>
-        </w:rPr>
-        <w:t xml:space="preserve"> </w:t>
+        <w:t xml:space="preserve">number of items </w:t>
       </w:r>
       <w:r>
         <w:rPr>
@@ -3276,6 +2038,7 @@
       <w:r>
         <w:rPr>
           <w:rFonts w:ascii="Calibri" w:hAnsi="Calibri" w:cs="Calibri"/>
+          <w:noProof/>
         </w:rPr>
         <w:drawing>
           <wp:inline distT="0" distB="0" distL="0" distR="0" wp14:anchorId="1FFD70DA" wp14:editId="4ADE8971">
@@ -3361,24 +2124,19 @@
         <w:rPr>
           <w:rFonts w:ascii="Calibri" w:hAnsi="Calibri" w:cs="Calibri"/>
         </w:rPr>
-        <w:t xml:space="preserve">When number of items provided </w:t>
-      </w:r>
-      <w:r>
-        <w:rPr>
-          <w:rFonts w:ascii="Calibri" w:hAnsi="Calibri" w:cs="Calibri"/>
-        </w:rPr>
-        <w:t>valid</w:t>
-      </w:r>
-    </w:p>
-    <w:p>
-      <w:pPr>
-        <w:rPr>
-          <w:rFonts w:ascii="Calibri" w:hAnsi="Calibri" w:cs="Calibri"/>
-        </w:rPr>
-      </w:pPr>
-      <w:r>
-        <w:rPr>
-          <w:rFonts w:ascii="Calibri" w:hAnsi="Calibri" w:cs="Calibri"/>
+        <w:t>When number of items provided valid</w:t>
+      </w:r>
+    </w:p>
+    <w:p>
+      <w:pPr>
+        <w:rPr>
+          <w:rFonts w:ascii="Calibri" w:hAnsi="Calibri" w:cs="Calibri"/>
+        </w:rPr>
+      </w:pPr>
+      <w:r>
+        <w:rPr>
+          <w:rFonts w:ascii="Calibri" w:hAnsi="Calibri" w:cs="Calibri"/>
+          <w:noProof/>
         </w:rPr>
         <w:drawing>
           <wp:inline distT="0" distB="0" distL="0" distR="0" wp14:anchorId="5C2E5A7F" wp14:editId="0BBDC1AA">
@@ -3462,16 +2220,7 @@
           <w:color w:val="4EA72E" w:themeColor="accent6"/>
         </w:rPr>
         <w:lastRenderedPageBreak/>
-        <w:t xml:space="preserve">Validations for </w:t>
-      </w:r>
-      <w:r>
-        <w:rPr>
-          <w:rFonts w:ascii="Calibri" w:hAnsi="Calibri" w:cs="Calibri"/>
-          <w:b/>
-          <w:bCs/>
-          <w:color w:val="4EA72E" w:themeColor="accent6"/>
-        </w:rPr>
-        <w:t>Item Name</w:t>
+        <w:t>Validations for Item Name</w:t>
       </w:r>
     </w:p>
     <w:p>
@@ -3516,24 +2265,19 @@
         <w:rPr>
           <w:rFonts w:ascii="Calibri" w:hAnsi="Calibri" w:cs="Calibri"/>
         </w:rPr>
-        <w:t xml:space="preserve">When input is empty for </w:t>
-      </w:r>
-      <w:r>
-        <w:rPr>
-          <w:rFonts w:ascii="Calibri" w:hAnsi="Calibri" w:cs="Calibri"/>
-        </w:rPr>
-        <w:t>item name</w:t>
-      </w:r>
-    </w:p>
-    <w:p>
-      <w:pPr>
-        <w:rPr>
-          <w:rFonts w:ascii="Calibri" w:hAnsi="Calibri" w:cs="Calibri"/>
-        </w:rPr>
-      </w:pPr>
-      <w:r>
-        <w:rPr>
-          <w:rFonts w:ascii="Calibri" w:hAnsi="Calibri" w:cs="Calibri"/>
+        <w:t>When input is empty for item name</w:t>
+      </w:r>
+    </w:p>
+    <w:p>
+      <w:pPr>
+        <w:rPr>
+          <w:rFonts w:ascii="Calibri" w:hAnsi="Calibri" w:cs="Calibri"/>
+        </w:rPr>
+      </w:pPr>
+      <w:r>
+        <w:rPr>
+          <w:rFonts w:ascii="Calibri" w:hAnsi="Calibri" w:cs="Calibri"/>
+          <w:noProof/>
         </w:rPr>
         <w:drawing>
           <wp:inline distT="0" distB="0" distL="0" distR="0" wp14:anchorId="2910586B" wp14:editId="20224496">
@@ -3621,13 +2365,7 @@
         <w:rPr>
           <w:rFonts w:ascii="Calibri" w:hAnsi="Calibri" w:cs="Calibri"/>
         </w:rPr>
-        <w:t xml:space="preserve">When input </w:t>
-      </w:r>
-      <w:r>
-        <w:rPr>
-          <w:rFonts w:ascii="Calibri" w:hAnsi="Calibri" w:cs="Calibri"/>
-        </w:rPr>
-        <w:t xml:space="preserve">for item name </w:t>
+        <w:t xml:space="preserve">When input for item name </w:t>
       </w:r>
       <w:r>
         <w:rPr>
@@ -3657,6 +2395,7 @@
       <w:r>
         <w:rPr>
           <w:rFonts w:ascii="Calibri" w:hAnsi="Calibri" w:cs="Calibri"/>
+          <w:noProof/>
         </w:rPr>
         <w:drawing>
           <wp:inline distT="0" distB="0" distL="0" distR="0" wp14:anchorId="1F28795D" wp14:editId="1B19F27A">
@@ -3774,6 +2513,7 @@
       <w:r>
         <w:rPr>
           <w:rFonts w:ascii="Calibri" w:hAnsi="Calibri" w:cs="Calibri"/>
+          <w:noProof/>
         </w:rPr>
         <w:drawing>
           <wp:inline distT="0" distB="0" distL="0" distR="0" wp14:anchorId="4A5A1AF8" wp14:editId="38AF4269">
@@ -3861,24 +2601,19 @@
         <w:rPr>
           <w:rFonts w:ascii="Calibri" w:hAnsi="Calibri" w:cs="Calibri"/>
         </w:rPr>
-        <w:t xml:space="preserve">When input for item name </w:t>
-      </w:r>
-      <w:r>
-        <w:rPr>
-          <w:rFonts w:ascii="Calibri" w:hAnsi="Calibri" w:cs="Calibri"/>
-        </w:rPr>
-        <w:t>is valid</w:t>
-      </w:r>
-    </w:p>
-    <w:p>
-      <w:pPr>
-        <w:rPr>
-          <w:rFonts w:ascii="Calibri" w:hAnsi="Calibri" w:cs="Calibri"/>
-        </w:rPr>
-      </w:pPr>
-      <w:r>
-        <w:rPr>
-          <w:rFonts w:ascii="Calibri" w:hAnsi="Calibri" w:cs="Calibri"/>
+        <w:t>When input for item name is valid</w:t>
+      </w:r>
+    </w:p>
+    <w:p>
+      <w:pPr>
+        <w:rPr>
+          <w:rFonts w:ascii="Calibri" w:hAnsi="Calibri" w:cs="Calibri"/>
+        </w:rPr>
+      </w:pPr>
+      <w:r>
+        <w:rPr>
+          <w:rFonts w:ascii="Calibri" w:hAnsi="Calibri" w:cs="Calibri"/>
+          <w:noProof/>
         </w:rPr>
         <w:drawing>
           <wp:inline distT="0" distB="0" distL="0" distR="0" wp14:anchorId="60BA2CCF" wp14:editId="26584029">
@@ -3958,36 +2693,19 @@
         <w:rPr>
           <w:rFonts w:ascii="Calibri" w:hAnsi="Calibri" w:cs="Calibri"/>
         </w:rPr>
-        <w:t xml:space="preserve"> When </w:t>
-      </w:r>
-      <w:r>
-        <w:rPr>
-          <w:rFonts w:ascii="Calibri" w:hAnsi="Calibri" w:cs="Calibri"/>
-        </w:rPr>
-        <w:t>Duplicate I</w:t>
-      </w:r>
-      <w:r>
-        <w:rPr>
-          <w:rFonts w:ascii="Calibri" w:hAnsi="Calibri" w:cs="Calibri"/>
-        </w:rPr>
-        <w:t xml:space="preserve">tem Name </w:t>
-      </w:r>
-      <w:r>
-        <w:rPr>
-          <w:rFonts w:ascii="Calibri" w:hAnsi="Calibri" w:cs="Calibri"/>
-        </w:rPr>
-        <w:t>is provided</w:t>
-      </w:r>
-    </w:p>
-    <w:p>
-      <w:pPr>
-        <w:rPr>
-          <w:rFonts w:ascii="Calibri" w:hAnsi="Calibri" w:cs="Calibri"/>
-        </w:rPr>
-      </w:pPr>
-      <w:r>
-        <w:rPr>
-          <w:rFonts w:ascii="Calibri" w:hAnsi="Calibri" w:cs="Calibri"/>
+        <w:t xml:space="preserve"> When Duplicate Item Name is provided</w:t>
+      </w:r>
+    </w:p>
+    <w:p>
+      <w:pPr>
+        <w:rPr>
+          <w:rFonts w:ascii="Calibri" w:hAnsi="Calibri" w:cs="Calibri"/>
+        </w:rPr>
+      </w:pPr>
+      <w:r>
+        <w:rPr>
+          <w:rFonts w:ascii="Calibri" w:hAnsi="Calibri" w:cs="Calibri"/>
+          <w:noProof/>
         </w:rPr>
         <w:drawing>
           <wp:inline distT="0" distB="0" distL="0" distR="0" wp14:anchorId="3DEE6C0A" wp14:editId="6D36DD73">
@@ -4043,59 +2761,45 @@
           <w:color w:val="4EA72E" w:themeColor="accent6"/>
         </w:rPr>
         <w:lastRenderedPageBreak/>
-        <w:t xml:space="preserve">Validations </w:t>
-      </w:r>
-      <w:r>
+        <w:t>Validations Item Quantity</w:t>
+      </w:r>
+    </w:p>
+    <w:p>
+      <w:pPr>
+        <w:rPr>
+          <w:rFonts w:ascii="Calibri" w:hAnsi="Calibri" w:cs="Calibri"/>
+        </w:rPr>
+      </w:pPr>
+      <w:r>
+        <w:rPr>
+          <w:rFonts w:ascii="Calibri" w:hAnsi="Calibri" w:cs="Calibri"/>
+          <w:b/>
+          <w:bCs/>
+        </w:rPr>
+        <w:t>Validation 1:</w:t>
+      </w:r>
+      <w:r>
+        <w:rPr>
+          <w:rFonts w:ascii="Calibri" w:hAnsi="Calibri" w:cs="Calibri"/>
+        </w:rPr>
+        <w:t xml:space="preserve"> When input is empty for item quantity</w:t>
+      </w:r>
+    </w:p>
+    <w:p>
+      <w:pPr>
         <w:rPr>
           <w:rFonts w:ascii="Calibri" w:hAnsi="Calibri" w:cs="Calibri"/>
           <w:b/>
           <w:bCs/>
           <w:color w:val="4EA72E" w:themeColor="accent6"/>
         </w:rPr>
-        <w:t>Item Quantity</w:t>
-      </w:r>
-    </w:p>
-    <w:p>
-      <w:pPr>
-        <w:rPr>
-          <w:rFonts w:ascii="Calibri" w:hAnsi="Calibri" w:cs="Calibri"/>
-        </w:rPr>
-      </w:pPr>
-      <w:r>
-        <w:rPr>
-          <w:rFonts w:ascii="Calibri" w:hAnsi="Calibri" w:cs="Calibri"/>
-          <w:b/>
-          <w:bCs/>
-        </w:rPr>
-        <w:t>Validation 1:</w:t>
-      </w:r>
-      <w:r>
-        <w:rPr>
-          <w:rFonts w:ascii="Calibri" w:hAnsi="Calibri" w:cs="Calibri"/>
-        </w:rPr>
-        <w:t xml:space="preserve"> When input is empty for </w:t>
-      </w:r>
-      <w:r>
-        <w:rPr>
-          <w:rFonts w:ascii="Calibri" w:hAnsi="Calibri" w:cs="Calibri"/>
-        </w:rPr>
-        <w:t>item quantity</w:t>
-      </w:r>
-    </w:p>
-    <w:p>
-      <w:pPr>
-        <w:rPr>
-          <w:rFonts w:ascii="Calibri" w:hAnsi="Calibri" w:cs="Calibri"/>
-          <w:b/>
-          <w:bCs/>
-          <w:color w:val="4EA72E" w:themeColor="accent6"/>
-        </w:rPr>
-      </w:pPr>
-      <w:r>
-        <w:rPr>
-          <w:rFonts w:ascii="Calibri" w:hAnsi="Calibri" w:cs="Calibri"/>
-          <w:b/>
-          <w:bCs/>
+      </w:pPr>
+      <w:r>
+        <w:rPr>
+          <w:rFonts w:ascii="Calibri" w:hAnsi="Calibri" w:cs="Calibri"/>
+          <w:b/>
+          <w:bCs/>
+          <w:noProof/>
           <w:color w:val="4EA72E" w:themeColor="accent6"/>
         </w:rPr>
         <w:drawing>
@@ -4176,30 +2880,19 @@
         <w:rPr>
           <w:rFonts w:ascii="Calibri" w:hAnsi="Calibri" w:cs="Calibri"/>
         </w:rPr>
-        <w:t xml:space="preserve"> When input provided for </w:t>
-      </w:r>
-      <w:r>
-        <w:rPr>
-          <w:rFonts w:ascii="Calibri" w:hAnsi="Calibri" w:cs="Calibri"/>
-        </w:rPr>
-        <w:t xml:space="preserve">item quantity </w:t>
-      </w:r>
-      <w:r>
-        <w:rPr>
-          <w:rFonts w:ascii="Calibri" w:hAnsi="Calibri" w:cs="Calibri"/>
-        </w:rPr>
-        <w:t>is strings</w:t>
-      </w:r>
-    </w:p>
-    <w:p>
-      <w:pPr>
-        <w:rPr>
-          <w:rFonts w:ascii="Calibri" w:hAnsi="Calibri" w:cs="Calibri"/>
-        </w:rPr>
-      </w:pPr>
-      <w:r>
-        <w:rPr>
-          <w:rFonts w:ascii="Calibri" w:hAnsi="Calibri" w:cs="Calibri"/>
+        <w:t xml:space="preserve"> When input provided for item quantity is strings</w:t>
+      </w:r>
+    </w:p>
+    <w:p>
+      <w:pPr>
+        <w:rPr>
+          <w:rFonts w:ascii="Calibri" w:hAnsi="Calibri" w:cs="Calibri"/>
+        </w:rPr>
+      </w:pPr>
+      <w:r>
+        <w:rPr>
+          <w:rFonts w:ascii="Calibri" w:hAnsi="Calibri" w:cs="Calibri"/>
+          <w:noProof/>
         </w:rPr>
         <w:drawing>
           <wp:inline distT="0" distB="0" distL="0" distR="0" wp14:anchorId="1EAEF0D1" wp14:editId="1A83E0A4">
@@ -4291,6 +2984,7 @@
       <w:r>
         <w:rPr>
           <w:rFonts w:ascii="Calibri" w:hAnsi="Calibri" w:cs="Calibri"/>
+          <w:noProof/>
         </w:rPr>
         <w:drawing>
           <wp:inline distT="0" distB="0" distL="0" distR="0" wp14:anchorId="493A7EA7" wp14:editId="7A5100D1">
@@ -4406,6 +3100,7 @@
       <w:r>
         <w:rPr>
           <w:rFonts w:ascii="Calibri" w:hAnsi="Calibri" w:cs="Calibri"/>
+          <w:noProof/>
         </w:rPr>
         <w:drawing>
           <wp:inline distT="0" distB="0" distL="0" distR="0" wp14:anchorId="4FB1D4D9" wp14:editId="286E0A2A">
@@ -4467,59 +3162,45 @@
           <w:bCs/>
           <w:color w:val="4EA72E" w:themeColor="accent6"/>
         </w:rPr>
-        <w:t xml:space="preserve">Validations Item </w:t>
-      </w:r>
-      <w:r>
+        <w:t>Validations Item Price</w:t>
+      </w:r>
+    </w:p>
+    <w:p>
+      <w:pPr>
+        <w:rPr>
+          <w:rFonts w:ascii="Calibri" w:hAnsi="Calibri" w:cs="Calibri"/>
+        </w:rPr>
+      </w:pPr>
+      <w:r>
+        <w:rPr>
+          <w:rFonts w:ascii="Calibri" w:hAnsi="Calibri" w:cs="Calibri"/>
+          <w:b/>
+          <w:bCs/>
+        </w:rPr>
+        <w:t>Validation 1:</w:t>
+      </w:r>
+      <w:r>
+        <w:rPr>
+          <w:rFonts w:ascii="Calibri" w:hAnsi="Calibri" w:cs="Calibri"/>
+        </w:rPr>
+        <w:t xml:space="preserve"> When input is empty for items price</w:t>
+      </w:r>
+    </w:p>
+    <w:p>
+      <w:pPr>
         <w:rPr>
           <w:rFonts w:ascii="Calibri" w:hAnsi="Calibri" w:cs="Calibri"/>
           <w:b/>
           <w:bCs/>
           <w:color w:val="4EA72E" w:themeColor="accent6"/>
         </w:rPr>
-        <w:t>Price</w:t>
-      </w:r>
-    </w:p>
-    <w:p>
-      <w:pPr>
-        <w:rPr>
-          <w:rFonts w:ascii="Calibri" w:hAnsi="Calibri" w:cs="Calibri"/>
-        </w:rPr>
-      </w:pPr>
-      <w:r>
-        <w:rPr>
-          <w:rFonts w:ascii="Calibri" w:hAnsi="Calibri" w:cs="Calibri"/>
-          <w:b/>
-          <w:bCs/>
-        </w:rPr>
-        <w:t>Validation 1:</w:t>
-      </w:r>
-      <w:r>
-        <w:rPr>
-          <w:rFonts w:ascii="Calibri" w:hAnsi="Calibri" w:cs="Calibri"/>
-        </w:rPr>
-        <w:t xml:space="preserve"> When input is empty for </w:t>
-      </w:r>
-      <w:r>
-        <w:rPr>
-          <w:rFonts w:ascii="Calibri" w:hAnsi="Calibri" w:cs="Calibri"/>
-        </w:rPr>
-        <w:t>items price</w:t>
-      </w:r>
-    </w:p>
-    <w:p>
-      <w:pPr>
-        <w:rPr>
-          <w:rFonts w:ascii="Calibri" w:hAnsi="Calibri" w:cs="Calibri"/>
-          <w:b/>
-          <w:bCs/>
-          <w:color w:val="4EA72E" w:themeColor="accent6"/>
-        </w:rPr>
-      </w:pPr>
-      <w:r>
-        <w:rPr>
-          <w:rFonts w:ascii="Calibri" w:hAnsi="Calibri" w:cs="Calibri"/>
-          <w:b/>
-          <w:bCs/>
+      </w:pPr>
+      <w:r>
+        <w:rPr>
+          <w:rFonts w:ascii="Calibri" w:hAnsi="Calibri" w:cs="Calibri"/>
+          <w:b/>
+          <w:bCs/>
+          <w:noProof/>
           <w:color w:val="4EA72E" w:themeColor="accent6"/>
         </w:rPr>
         <w:drawing>
@@ -4632,6 +3313,7 @@
       <w:r>
         <w:rPr>
           <w:rFonts w:ascii="Calibri" w:hAnsi="Calibri" w:cs="Calibri"/>
+          <w:noProof/>
         </w:rPr>
         <w:drawing>
           <wp:inline distT="0" distB="0" distL="0" distR="0" wp14:anchorId="40E4A1DA" wp14:editId="04AFA479">
@@ -4737,6 +3419,7 @@
       <w:r>
         <w:rPr>
           <w:rFonts w:ascii="Calibri" w:hAnsi="Calibri" w:cs="Calibri"/>
+          <w:noProof/>
         </w:rPr>
         <w:drawing>
           <wp:inline distT="0" distB="0" distL="0" distR="0" wp14:anchorId="00C1049F" wp14:editId="0FC21034">
@@ -4852,6 +3535,7 @@
       <w:r>
         <w:rPr>
           <w:rFonts w:ascii="Calibri" w:hAnsi="Calibri" w:cs="Calibri"/>
+          <w:noProof/>
         </w:rPr>
         <w:drawing>
           <wp:inline distT="0" distB="0" distL="0" distR="0" wp14:anchorId="5F9D2C1E" wp14:editId="4EFA2CAD">
@@ -4986,7 +3670,6 @@
           <w:color w:val="4EA72E" w:themeColor="accent6"/>
         </w:rPr>
       </w:pPr>
-      <w:proofErr w:type="gramStart"/>
       <w:r>
         <w:rPr>
           <w:rFonts w:ascii="Calibri" w:hAnsi="Calibri" w:cs="Calibri"/>
@@ -4997,17 +3680,17 @@
         <w:lastRenderedPageBreak/>
         <w:t>Final Result</w:t>
       </w:r>
-      <w:proofErr w:type="gramEnd"/>
-    </w:p>
-    <w:p>
-      <w:pPr>
-        <w:rPr>
-          <w:rFonts w:ascii="Calibri" w:hAnsi="Calibri" w:cs="Calibri"/>
-        </w:rPr>
-      </w:pPr>
-      <w:r>
-        <w:rPr>
-          <w:rFonts w:ascii="Calibri" w:hAnsi="Calibri" w:cs="Calibri"/>
+    </w:p>
+    <w:p>
+      <w:pPr>
+        <w:rPr>
+          <w:rFonts w:ascii="Calibri" w:hAnsi="Calibri" w:cs="Calibri"/>
+        </w:rPr>
+      </w:pPr>
+      <w:r>
+        <w:rPr>
+          <w:rFonts w:ascii="Calibri" w:hAnsi="Calibri" w:cs="Calibri"/>
+          <w:noProof/>
         </w:rPr>
         <w:drawing>
           <wp:inline distT="0" distB="0" distL="0" distR="0" wp14:anchorId="3BF19DCF" wp14:editId="68560FAF">
@@ -5034,6 +3717,73 @@
                     <a:xfrm>
                       <a:off x="0" y="0"/>
                       <a:ext cx="5943600" cy="3256915"/>
+                    </a:xfrm>
+                    <a:prstGeom prst="rect">
+                      <a:avLst/>
+                    </a:prstGeom>
+                  </pic:spPr>
+                </pic:pic>
+              </a:graphicData>
+            </a:graphic>
+          </wp:inline>
+        </w:drawing>
+      </w:r>
+    </w:p>
+    <w:p>
+      <w:pPr>
+        <w:rPr>
+          <w:rFonts w:ascii="Calibri" w:hAnsi="Calibri" w:cs="Calibri"/>
+        </w:rPr>
+      </w:pPr>
+    </w:p>
+    <w:p>
+      <w:pPr>
+        <w:rPr>
+          <w:rFonts w:ascii="Calibri" w:hAnsi="Calibri" w:cs="Calibri"/>
+        </w:rPr>
+      </w:pPr>
+      <w:r>
+        <w:rPr>
+          <w:rFonts w:ascii="Calibri" w:hAnsi="Calibri" w:cs="Calibri"/>
+        </w:rPr>
+        <w:t>Git</w:t>
+      </w:r>
+    </w:p>
+    <w:p>
+      <w:pPr>
+        <w:rPr>
+          <w:rFonts w:ascii="Calibri" w:hAnsi="Calibri" w:cs="Calibri"/>
+        </w:rPr>
+      </w:pPr>
+      <w:r>
+        <w:rPr>
+          <w:rFonts w:ascii="Calibri" w:hAnsi="Calibri" w:cs="Calibri"/>
+        </w:rPr>
+        <w:drawing>
+          <wp:inline distT="0" distB="0" distL="0" distR="0" wp14:anchorId="32D9E1B8" wp14:editId="097E4D21">
+            <wp:extent cx="5943600" cy="2271395"/>
+            <wp:effectExtent l="0" t="0" r="0" b="0"/>
+            <wp:docPr id="1285601075" name="Picture 1"/>
+            <wp:cNvGraphicFramePr>
+              <a:graphicFrameLocks xmlns:a="http://schemas.openxmlformats.org/drawingml/2006/main" noChangeAspect="1"/>
+            </wp:cNvGraphicFramePr>
+            <a:graphic xmlns:a="http://schemas.openxmlformats.org/drawingml/2006/main">
+              <a:graphicData uri="http://schemas.openxmlformats.org/drawingml/2006/picture">
+                <pic:pic xmlns:pic="http://schemas.openxmlformats.org/drawingml/2006/picture">
+                  <pic:nvPicPr>
+                    <pic:cNvPr id="1285601075" name=""/>
+                    <pic:cNvPicPr/>
+                  </pic:nvPicPr>
+                  <pic:blipFill>
+                    <a:blip r:embed="rId28"/>
+                    <a:stretch>
+                      <a:fillRect/>
+                    </a:stretch>
+                  </pic:blipFill>
+                  <pic:spPr>
+                    <a:xfrm>
+                      <a:off x="0" y="0"/>
+                      <a:ext cx="5943600" cy="2271395"/>
                     </a:xfrm>
                     <a:prstGeom prst="rect">
                       <a:avLst/>
@@ -5657,6 +4407,7 @@
   <w:style w:type="character" w:default="1" w:styleId="DefaultParagraphFont">
     <w:name w:val="Default Paragraph Font"/>
     <w:uiPriority w:val="1"/>
+    <w:semiHidden/>
     <w:unhideWhenUsed/>
   </w:style>
   <w:style w:type="table" w:default="1" w:styleId="TableNormal">

</xml_diff>